<commit_message>
Deploying to gh-pages from  @ 383f71fc49619cf7cd59535cf7e024f82f5b8bde 🚀
</commit_message>
<xml_diff>
--- a/images/Resume.docx
+++ b/images/Resume.docx
@@ -22,7 +22,6 @@
         <w:rPr>
           <w:rFonts w:ascii="Arial" w:hAnsi="Arial" w:eastAsia="Arial" w:cs="Arial"/>
           <w:b/>
-          <w:b/>
           <w:bCs/>
         </w:rPr>
       </w:pPr>
@@ -64,7 +63,11 @@
           <w:rFonts w:ascii="Arial" w:hAnsi="Arial"/>
           <w:lang w:val="en-US"/>
         </w:rPr>
-        <w:t>I am junior developer with about 2 years of relevant work experience using DevOps and Agile to develop software and resolve issues. I am proficient in multiple programming languages and am eager to expand my knowledge of the development process. I have experience with C#, Python, and Java. I graduated with my Bachelors of Applied Science, Business &amp; Organizational Management with Management Information Specialization with highest honors of Summa cum laude. I hold multiple industry certifications including CompTIA. I am focused on my future- would love to find a career path where I can continue to grow in the tech field.</w:t>
+        <w:t>Junior software developer with two years of experience building and supporting applications in Agile and DevOps environments. Skilled in C#, Python, Java, and full</w:t>
+        <w:noBreakHyphen/>
+        <w:t>stack development frameworks, with strong analytical and problem</w:t>
+        <w:noBreakHyphen/>
+        <w:t>solving abilities. Graduated Summa Cum Laude with a Bachelor of Applied Science in Business &amp; Organizational Management (MIS specialization). Holds multiple industry certifications, including CompTIA A+, Network+, and Security+. Motivated to grow within the tech field and contribute to impactful software solutions.</w:t>
       </w:r>
     </w:p>
     <w:p>
@@ -105,7 +108,7 @@
           <w:ilvl w:val="0"/>
           <w:numId w:val="9"/>
         </w:numPr>
-        <w:ind w:left="720" w:right="0" w:hanging="360"/>
+        <w:ind w:hanging="360" w:left="720" w:right="0"/>
         <w:jc w:val="left"/>
         <w:rPr/>
       </w:pPr>
@@ -124,7 +127,7 @@
           <w:ilvl w:val="0"/>
           <w:numId w:val="9"/>
         </w:numPr>
-        <w:ind w:left="720" w:right="0" w:hanging="360"/>
+        <w:ind w:hanging="360" w:left="720" w:right="0"/>
         <w:jc w:val="left"/>
         <w:rPr/>
       </w:pPr>
@@ -143,7 +146,7 @@
           <w:ilvl w:val="0"/>
           <w:numId w:val="9"/>
         </w:numPr>
-        <w:ind w:left="720" w:right="0" w:hanging="360"/>
+        <w:ind w:hanging="360" w:left="720" w:right="0"/>
         <w:jc w:val="left"/>
         <w:rPr/>
       </w:pPr>
@@ -162,7 +165,7 @@
           <w:ilvl w:val="0"/>
           <w:numId w:val="9"/>
         </w:numPr>
-        <w:ind w:left="720" w:right="0" w:hanging="360"/>
+        <w:ind w:hanging="360" w:left="720" w:right="0"/>
         <w:jc w:val="left"/>
         <w:rPr/>
       </w:pPr>
@@ -181,7 +184,7 @@
           <w:ilvl w:val="0"/>
           <w:numId w:val="9"/>
         </w:numPr>
-        <w:ind w:left="720" w:right="0" w:hanging="360"/>
+        <w:ind w:hanging="360" w:left="720" w:right="0"/>
         <w:jc w:val="left"/>
         <w:rPr/>
       </w:pPr>
@@ -200,7 +203,7 @@
           <w:ilvl w:val="0"/>
           <w:numId w:val="9"/>
         </w:numPr>
-        <w:ind w:left="720" w:right="0" w:hanging="360"/>
+        <w:ind w:hanging="360" w:left="720" w:right="0"/>
         <w:jc w:val="left"/>
         <w:rPr/>
       </w:pPr>
@@ -219,7 +222,7 @@
           <w:ilvl w:val="0"/>
           <w:numId w:val="9"/>
         </w:numPr>
-        <w:ind w:left="720" w:right="0" w:hanging="360"/>
+        <w:ind w:hanging="360" w:left="720" w:right="0"/>
         <w:jc w:val="left"/>
         <w:rPr/>
       </w:pPr>
@@ -238,7 +241,7 @@
           <w:ilvl w:val="0"/>
           <w:numId w:val="9"/>
         </w:numPr>
-        <w:ind w:left="720" w:right="0" w:hanging="360"/>
+        <w:ind w:hanging="360" w:left="720" w:right="0"/>
         <w:jc w:val="left"/>
         <w:rPr/>
       </w:pPr>
@@ -247,7 +250,7 @@
           <w:rFonts w:ascii="Arial" w:hAnsi="Arial"/>
           <w:lang w:val="en-US"/>
         </w:rPr>
-        <w:t>Microsoft Office Specialist – Excel and Access</w:t>
+        <w:t>Microsoft Office Specialist: Excel, Access</w:t>
       </w:r>
     </w:p>
     <w:p>
@@ -257,7 +260,7 @@
           <w:ilvl w:val="0"/>
           <w:numId w:val="9"/>
         </w:numPr>
-        <w:ind w:left="720" w:right="0" w:hanging="360"/>
+        <w:ind w:hanging="360" w:left="720" w:right="0"/>
         <w:jc w:val="left"/>
         <w:rPr>
           <w:rFonts w:ascii="Arial" w:hAnsi="Arial"/>
@@ -276,28 +279,6 @@
         <w:pStyle w:val="BodyA"/>
         <w:rPr>
           <w:rFonts w:ascii="Arial" w:hAnsi="Arial" w:eastAsia="Arial" w:cs="Arial"/>
-        </w:rPr>
-      </w:pPr>
-      <w:r>
-        <w:rPr>
-          <w:rFonts w:eastAsia="Arial" w:cs="Arial" w:ascii="Arial" w:hAnsi="Arial"/>
-        </w:rPr>
-      </w:r>
-    </w:p>
-    <w:p>
-      <w:pPr>
-        <w:pStyle w:val="ListParagraph"/>
-        <w:tabs>
-          <w:tab w:val="clear" w:pos="720"/>
-          <w:tab w:val="right" w:pos="8640" w:leader="none"/>
-        </w:tabs>
-        <w:ind w:left="0" w:right="0" w:hanging="0"/>
-        <w:jc w:val="center"/>
-        <w:rPr>
-          <w:rFonts w:ascii="Arial" w:hAnsi="Arial" w:eastAsia="Arial" w:cs="Arial"/>
-          <w:b/>
-          <w:b/>
-          <w:bCs/>
         </w:rPr>
       </w:pPr>
       <w:r>
@@ -315,7 +296,7 @@
           <w:tab w:val="clear" w:pos="720"/>
           <w:tab w:val="right" w:pos="8640" w:leader="none"/>
         </w:tabs>
-        <w:ind w:left="0" w:right="0" w:hanging="0"/>
+        <w:ind w:hanging="0" w:left="0" w:right="0"/>
         <w:jc w:val="center"/>
         <w:rPr>
           <w:rFonts w:ascii="Arial" w:hAnsi="Arial"/>
@@ -345,7 +326,7 @@
         </w:tabs>
         <w:bidi w:val="0"/>
         <w:spacing w:lineRule="auto" w:line="240" w:before="0" w:after="0"/>
-        <w:ind w:left="0" w:right="0" w:hanging="0"/>
+        <w:ind w:hanging="0" w:left="0" w:right="0"/>
         <w:jc w:val="left"/>
         <w:rPr>
           <w:rFonts w:ascii="Arial" w:hAnsi="Arial"/>
@@ -369,7 +350,7 @@
           <w:tab w:val="clear" w:pos="720"/>
           <w:tab w:val="right" w:pos="8640" w:leader="none"/>
         </w:tabs>
-        <w:ind w:left="0" w:right="0" w:hanging="0"/>
+        <w:ind w:hanging="0" w:left="0" w:right="0"/>
         <w:jc w:val="left"/>
         <w:rPr>
           <w:rFonts w:ascii="Arial" w:hAnsi="Arial"/>
@@ -395,7 +376,7 @@
           <w:tab w:val="clear" w:pos="720"/>
           <w:tab w:val="right" w:pos="8640" w:leader="none"/>
         </w:tabs>
-        <w:ind w:left="1080" w:right="0" w:hanging="360"/>
+        <w:ind w:hanging="360" w:left="1080" w:right="0"/>
         <w:jc w:val="left"/>
         <w:rPr/>
       </w:pPr>
@@ -405,7 +386,34 @@
           <w:b w:val="false"/>
           <w:bCs w:val="false"/>
         </w:rPr>
-        <w:t>Develops in C#, Dotnet, VB.Net and SQL.</w:t>
+        <w:t xml:space="preserve"> </w:t>
+      </w:r>
+      <w:r>
+        <w:rPr>
+          <w:rFonts w:ascii="Arial" w:hAnsi="Arial"/>
+          <w:b w:val="false"/>
+          <w:bCs w:val="false"/>
+        </w:rPr>
+        <w:t xml:space="preserve">Develop and maintain applications using C#, .NET, </w:t>
+      </w:r>
+      <w:hyperlink r:id="rId2" w:tgtFrame="_blank">
+        <w:r>
+          <w:rPr>
+            <w:rStyle w:val="Hyperlink"/>
+            <w:rFonts w:ascii="Arial" w:hAnsi="Arial"/>
+            <w:b w:val="false"/>
+            <w:bCs w:val="false"/>
+          </w:rPr>
+          <w:t>VB.NET</w:t>
+        </w:r>
+      </w:hyperlink>
+      <w:r>
+        <w:rPr>
+          <w:rFonts w:ascii="Arial" w:hAnsi="Arial"/>
+          <w:b w:val="false"/>
+          <w:bCs w:val="false"/>
+        </w:rPr>
+        <w:t>, and SQL.</w:t>
       </w:r>
     </w:p>
     <w:p>
@@ -419,11 +427,9 @@
           <w:tab w:val="clear" w:pos="720"/>
           <w:tab w:val="right" w:pos="8640" w:leader="none"/>
         </w:tabs>
-        <w:ind w:left="1080" w:right="0" w:hanging="360"/>
+        <w:ind w:hanging="360" w:left="1080" w:right="0"/>
         <w:jc w:val="left"/>
-        <w:rPr>
-          <w:rFonts w:ascii="Arial" w:hAnsi="Arial"/>
-        </w:rPr>
+        <w:rPr/>
       </w:pPr>
       <w:r>
         <w:rPr>
@@ -431,7 +437,41 @@
           <w:b w:val="false"/>
           <w:bCs w:val="false"/>
         </w:rPr>
-        <w:t>Work on a Team to develop and maintain a product for our customers.</w:t>
+        <w:t>Collaborate with a development team to enhance and support customer</w:t>
+        <w:noBreakHyphen/>
+        <w:t>facing products.</w:t>
+      </w:r>
+    </w:p>
+    <w:p>
+      <w:pPr>
+        <w:pStyle w:val="ListParagraph"/>
+        <w:numPr>
+          <w:ilvl w:val="0"/>
+          <w:numId w:val="7"/>
+        </w:numPr>
+        <w:tabs>
+          <w:tab w:val="clear" w:pos="720"/>
+          <w:tab w:val="right" w:pos="8640" w:leader="none"/>
+        </w:tabs>
+        <w:ind w:hanging="360" w:left="1080" w:right="0"/>
+        <w:jc w:val="left"/>
+        <w:rPr/>
+      </w:pPr>
+      <w:r>
+        <w:rPr>
+          <w:rFonts w:ascii="Arial" w:hAnsi="Arial"/>
+          <w:b w:val="false"/>
+          <w:bCs w:val="false"/>
+        </w:rPr>
+        <w:t xml:space="preserve"> </w:t>
+      </w:r>
+      <w:r>
+        <w:rPr>
+          <w:rFonts w:ascii="Arial" w:hAnsi="Arial"/>
+          <w:b w:val="false"/>
+          <w:bCs w:val="false"/>
+        </w:rPr>
+        <w:t>Participate in debugging, feature development, and Agile sprint activities.</w:t>
       </w:r>
     </w:p>
     <w:p>
@@ -445,7 +485,7 @@
           <w:tab w:val="clear" w:pos="720"/>
           <w:tab w:val="right" w:pos="8640" w:leader="none"/>
         </w:tabs>
-        <w:ind w:left="720" w:right="0" w:hanging="0"/>
+        <w:ind w:hanging="0" w:left="720" w:right="0"/>
         <w:jc w:val="left"/>
         <w:rPr>
           <w:rFonts w:ascii="Arial" w:hAnsi="Arial"/>
@@ -461,7 +501,7 @@
       <w:pPr>
         <w:pStyle w:val="BodyA"/>
         <w:keepLines w:val="false"/>
-        <w:ind w:left="0" w:right="0" w:hanging="0"/>
+        <w:ind w:hanging="0" w:left="0" w:right="0"/>
         <w:jc w:val="left"/>
         <w:rPr>
           <w:rFonts w:ascii="Arial" w:hAnsi="Arial"/>
@@ -512,7 +552,7 @@
           <w:ilvl w:val="0"/>
           <w:numId w:val="8"/>
         </w:numPr>
-        <w:ind w:left="1069" w:right="0" w:hanging="360"/>
+        <w:ind w:hanging="360" w:left="1069" w:right="0"/>
         <w:jc w:val="left"/>
         <w:rPr/>
       </w:pPr>
@@ -523,7 +563,9 @@
           <w:bCs w:val="false"/>
           <w:lang w:val="en-US"/>
         </w:rPr>
-        <w:t>Full Stack Development in Ruby-on-Rails, ReactJS, Java, Angular, PostgreSQL</w:t>
+        <w:t>Completed full</w:t>
+        <w:noBreakHyphen/>
+        <w:t>stack development training in Ruby on Rails, ReactJS, Java, Angular, and PostgreSQL.</w:t>
       </w:r>
     </w:p>
     <w:p>
@@ -533,7 +575,7 @@
           <w:ilvl w:val="0"/>
           <w:numId w:val="8"/>
         </w:numPr>
-        <w:ind w:left="1069" w:right="0" w:hanging="360"/>
+        <w:ind w:hanging="360" w:left="1069" w:right="0"/>
         <w:jc w:val="left"/>
         <w:rPr/>
       </w:pPr>
@@ -544,17 +586,39 @@
           <w:bCs w:val="false"/>
           <w:lang w:val="en-US"/>
         </w:rPr>
-        <w:t>Worked on two team projects in a short time.</w:t>
+        <w:t>Delivered two team</w:t>
+        <w:noBreakHyphen/>
+        <w:t>based projects under accelerated timelines.</w:t>
       </w:r>
     </w:p>
     <w:p>
       <w:pPr>
         <w:pStyle w:val="BodyA"/>
-        <w:ind w:left="0" w:right="0" w:hanging="0"/>
+        <w:numPr>
+          <w:ilvl w:val="0"/>
+          <w:numId w:val="8"/>
+        </w:numPr>
+        <w:ind w:hanging="360" w:left="1069" w:right="0"/>
         <w:jc w:val="left"/>
+        <w:rPr/>
+      </w:pPr>
+      <w:r>
+        <w:rPr>
+          <w:rFonts w:ascii="Arial" w:hAnsi="Arial"/>
+          <w:b w:val="false"/>
+          <w:bCs w:val="false"/>
+          <w:lang w:val="en-US"/>
+        </w:rPr>
+        <w:t>Applied Agile methodologies, version control, and clean coding practices.</w:t>
+      </w:r>
+    </w:p>
+    <w:p>
+      <w:pPr>
+        <w:pStyle w:val="BodyA"/>
+        <w:ind w:hanging="0" w:left="0" w:right="0"/>
+        <w:jc w:val="left"/>
         <w:rPr>
           <w:rFonts w:ascii="Arial" w:hAnsi="Arial" w:eastAsia="Arial" w:cs="Arial"/>
-          <w:b/>
           <w:b/>
           <w:bCs/>
           <w:lang w:val="en-US"/>
@@ -576,7 +640,7 @@
           <w:tab w:val="clear" w:pos="720"/>
           <w:tab w:val="right" w:pos="8640" w:leader="none"/>
         </w:tabs>
-        <w:ind w:left="0" w:right="0" w:hanging="0"/>
+        <w:ind w:hanging="0" w:left="0" w:right="0"/>
         <w:rPr>
           <w:rFonts w:ascii="Arial" w:hAnsi="Arial" w:eastAsia="Arial" w:cs="Arial"/>
         </w:rPr>
@@ -654,7 +718,7 @@
           <w:ilvl w:val="0"/>
           <w:numId w:val="2"/>
         </w:numPr>
-        <w:ind w:left="720" w:right="0" w:hanging="360"/>
+        <w:ind w:hanging="360" w:left="720" w:right="0"/>
         <w:jc w:val="left"/>
         <w:rPr/>
       </w:pPr>
@@ -663,37 +727,26 @@
           <w:rFonts w:ascii="Arial" w:hAnsi="Arial"/>
           <w:lang w:val="en-US"/>
         </w:rPr>
-        <w:t xml:space="preserve"> </w:t>
-      </w:r>
-      <w:r>
-        <w:rPr>
-          <w:rFonts w:ascii="Arial" w:hAnsi="Arial"/>
-          <w:lang w:val="en-US"/>
-        </w:rPr>
-        <w:t>Assist IT students with classwork including Microsoft Office suite, A+ Fundamentals, and Web Programming</w:t>
-      </w:r>
-    </w:p>
-    <w:p>
-      <w:pPr>
-        <w:pStyle w:val="BodyA"/>
+        <w:t>Assisted students with coursework in Microsoft Office, A+ Fundamentals, and web programming.</w:t>
+      </w:r>
+    </w:p>
+    <w:p>
+      <w:pPr>
+        <w:pStyle w:val="ListParagraph"/>
         <w:numPr>
           <w:ilvl w:val="0"/>
-          <w:numId w:val="0"/>
+          <w:numId w:val="2"/>
         </w:numPr>
-        <w:ind w:left="720" w:right="0" w:hanging="0"/>
-        <w:rPr>
-          <w:rFonts w:ascii="Arial" w:hAnsi="Arial" w:eastAsia="Arial" w:cs="Arial"/>
-          <w:b/>
-          <w:b/>
-          <w:bCs/>
-        </w:rPr>
-      </w:pPr>
-      <w:r>
-        <w:rPr>
-          <w:rFonts w:eastAsia="Arial" w:cs="Arial" w:ascii="Arial" w:hAnsi="Arial"/>
-          <w:b/>
-          <w:bCs/>
-        </w:rPr>
+        <w:ind w:hanging="360" w:left="720" w:right="0"/>
+        <w:jc w:val="left"/>
+        <w:rPr/>
+      </w:pPr>
+      <w:r>
+        <w:rPr>
+          <w:rFonts w:ascii="Arial" w:hAnsi="Arial"/>
+          <w:lang w:val="en-US"/>
+        </w:rPr>
+        <w:t>Supported learners in developing foundational IT and troubleshooting skills.</w:t>
       </w:r>
       <w:r>
         <w:br w:type="page"/>
@@ -705,7 +758,6 @@
         <w:spacing w:before="0" w:after="0"/>
         <w:rPr>
           <w:rFonts w:ascii="Arial" w:hAnsi="Arial" w:eastAsia="Arial" w:cs="Arial"/>
-          <w:b/>
           <w:b/>
           <w:bCs/>
         </w:rPr>
@@ -825,7 +877,7 @@
           <w:ilvl w:val="0"/>
           <w:numId w:val="6"/>
         </w:numPr>
-        <w:ind w:left="720" w:right="0" w:hanging="360"/>
+        <w:ind w:hanging="360" w:left="720" w:right="0"/>
         <w:jc w:val="left"/>
         <w:rPr/>
       </w:pPr>
@@ -834,7 +886,7 @@
           <w:rFonts w:ascii="Arial" w:hAnsi="Arial"/>
           <w:lang w:val="en-US"/>
         </w:rPr>
-        <w:t xml:space="preserve">Member, Phi Theta Kappa Honor Society.     </w:t>
+        <w:t>Graduated Summa Cum Laude</w:t>
       </w:r>
     </w:p>
     <w:p>
@@ -844,24 +896,41 @@
           <w:ilvl w:val="0"/>
           <w:numId w:val="6"/>
         </w:numPr>
-        <w:ind w:left="720" w:right="0" w:hanging="360"/>
+        <w:ind w:hanging="360" w:left="720" w:right="0"/>
         <w:jc w:val="left"/>
-        <w:rPr>
-          <w:rFonts w:ascii="Arial" w:hAnsi="Arial"/>
-        </w:rPr>
-      </w:pPr>
-      <w:r>
-        <w:rPr>
-          <w:rFonts w:ascii="Arial" w:hAnsi="Arial"/>
-          <w:lang w:val="en-US"/>
-        </w:rPr>
-        <w:t>Coursework completed in Java, Python and Database Management</w:t>
+        <w:rPr/>
+      </w:pPr>
+      <w:r>
+        <w:rPr>
+          <w:rFonts w:ascii="Arial" w:hAnsi="Arial"/>
+          <w:lang w:val="en-US"/>
+        </w:rPr>
+        <w:t>Member, Phi Theta Kappa Honor Society</w:t>
+      </w:r>
+    </w:p>
+    <w:p>
+      <w:pPr>
+        <w:pStyle w:val="ListParagraph"/>
+        <w:numPr>
+          <w:ilvl w:val="0"/>
+          <w:numId w:val="6"/>
+        </w:numPr>
+        <w:ind w:hanging="360" w:left="720" w:right="0"/>
+        <w:jc w:val="left"/>
+        <w:rPr/>
+      </w:pPr>
+      <w:r>
+        <w:rPr>
+          <w:rFonts w:ascii="Arial" w:hAnsi="Arial"/>
+          <w:lang w:val="en-US"/>
+        </w:rPr>
+        <w:t>Completed coursework in Java, Python, and Database Management</w:t>
       </w:r>
     </w:p>
     <w:p>
       <w:pPr>
         <w:pStyle w:val="Normal"/>
-        <w:ind w:right="0" w:hanging="0"/>
+        <w:ind w:right="0"/>
         <w:jc w:val="left"/>
         <w:rPr>
           <w:rFonts w:ascii="Arial" w:hAnsi="Arial"/>
@@ -878,7 +947,7 @@
     <w:p>
       <w:pPr>
         <w:pStyle w:val="Normal"/>
-        <w:ind w:right="0" w:hanging="0"/>
+        <w:ind w:right="0"/>
         <w:jc w:val="left"/>
         <w:rPr>
           <w:rFonts w:ascii="Arial" w:hAnsi="Arial"/>
@@ -909,7 +978,7 @@
     <w:p>
       <w:pPr>
         <w:pStyle w:val="Normal"/>
-        <w:ind w:right="0" w:hanging="0"/>
+        <w:ind w:right="0"/>
         <w:jc w:val="left"/>
         <w:rPr>
           <w:rFonts w:ascii="Arial" w:hAnsi="Arial"/>
@@ -1037,7 +1106,7 @@
           <w:ilvl w:val="0"/>
           <w:numId w:val="5"/>
         </w:numPr>
-        <w:ind w:left="720" w:right="0" w:hanging="360"/>
+        <w:ind w:hanging="360" w:left="720" w:right="0"/>
         <w:jc w:val="left"/>
         <w:rPr/>
       </w:pPr>
@@ -1046,7 +1115,7 @@
           <w:rFonts w:ascii="Arial" w:hAnsi="Arial"/>
           <w:lang w:val="en-US"/>
         </w:rPr>
-        <w:t>Member, Phi Theta Kappa Honor Society.</w:t>
+        <w:t>Member, Phi Theta Kappa Honor Society</w:t>
       </w:r>
     </w:p>
     <w:p>
@@ -1056,31 +1125,16 @@
           <w:ilvl w:val="0"/>
           <w:numId w:val="5"/>
         </w:numPr>
-        <w:ind w:left="720" w:right="0" w:hanging="360"/>
+        <w:ind w:hanging="360" w:left="720" w:right="0"/>
         <w:jc w:val="left"/>
-        <w:rPr>
-          <w:rFonts w:ascii="Arial" w:hAnsi="Arial"/>
-        </w:rPr>
-      </w:pPr>
-      <w:r>
-        <w:rPr>
-          <w:rFonts w:ascii="Arial" w:hAnsi="Arial"/>
-          <w:lang w:val="en-US"/>
-        </w:rPr>
-        <w:t>College Credit Certificates in IT Analysis, IT Support, and Help Desk Support</w:t>
-      </w:r>
-    </w:p>
-    <w:p>
-      <w:pPr>
-        <w:pStyle w:val="BodyA"/>
-        <w:rPr>
-          <w:rFonts w:ascii="Arial" w:hAnsi="Arial" w:eastAsia="Arial" w:cs="Arial"/>
-        </w:rPr>
-      </w:pPr>
-      <w:r>
-        <w:rPr>
-          <w:rFonts w:eastAsia="Arial" w:cs="Arial" w:ascii="Arial" w:hAnsi="Arial"/>
-        </w:rPr>
+        <w:rPr/>
+      </w:pPr>
+      <w:r>
+        <w:rPr>
+          <w:rFonts w:ascii="Arial" w:hAnsi="Arial"/>
+          <w:lang w:val="en-US"/>
+        </w:rPr>
+        <w:t>Earned certificates in IT Analysis, IT Support, and Help Desk Support</w:t>
       </w:r>
     </w:p>
     <w:p>
@@ -1096,18 +1150,14 @@
       </w:pPr>
       <w:r>
         <w:rPr>
-          <w:rFonts w:eastAsia="Arial" w:cs="Arial" w:ascii="Arial" w:hAnsi="Arial"/>
-        </w:rPr>
-        <w:tab/>
+          <w:rFonts w:ascii="Arial" w:hAnsi="Arial"/>
+        </w:rPr>
       </w:r>
     </w:p>
     <w:p>
       <w:pPr>
         <w:pStyle w:val="BodyA"/>
-        <w:tabs>
-          <w:tab w:val="clear" w:pos="720"/>
-          <w:tab w:val="right" w:pos="8640" w:leader="none"/>
-        </w:tabs>
+        <w:jc w:val="center"/>
         <w:rPr>
           <w:rFonts w:ascii="Arial" w:hAnsi="Arial"/>
         </w:rPr>
@@ -1117,46 +1167,9 @@
           <w:rFonts w:ascii="Arial" w:hAnsi="Arial"/>
           <w:b/>
           <w:bCs/>
-          <w:i/>
-          <w:iCs/>
-          <w:lang w:val="en-US"/>
-        </w:rPr>
-        <w:t>Support Specialist</w:t>
-      </w:r>
-      <w:r>
-        <w:rPr>
-          <w:rFonts w:ascii="Arial" w:hAnsi="Arial"/>
-          <w:lang w:val="en-US"/>
-        </w:rPr>
-        <w:t>, Withlacoochee Technical College</w:t>
-        <w:tab/>
-        <w:t xml:space="preserve">                              </w:t>
-      </w:r>
-      <w:r>
-        <w:rPr>
-          <w:rFonts w:ascii="Arial" w:hAnsi="Arial"/>
-          <w:b/>
-          <w:bCs/>
-          <w:lang w:val="en-US"/>
-        </w:rPr>
-        <w:t>Inverness, FL</w:t>
-      </w:r>
-    </w:p>
-    <w:p>
-      <w:pPr>
-        <w:pStyle w:val="BodyA"/>
-        <w:tabs>
-          <w:tab w:val="clear" w:pos="720"/>
-          <w:tab w:val="right" w:pos="8640" w:leader="none"/>
-        </w:tabs>
-        <w:rPr>
-          <w:rFonts w:ascii="Arial" w:hAnsi="Arial"/>
-        </w:rPr>
-      </w:pPr>
-      <w:r>
-        <w:rPr>
-          <w:rFonts w:ascii="Arial" w:hAnsi="Arial"/>
-        </w:rPr>
+          <w:lang w:val="en-US"/>
+        </w:rPr>
+        <w:t>Internship Experience</w:t>
       </w:r>
     </w:p>
     <w:p>
@@ -1164,26 +1177,7 @@
         <w:pStyle w:val="BodyA"/>
         <w:jc w:val="center"/>
         <w:rPr>
-          <w:rFonts w:ascii="Arial" w:hAnsi="Arial"/>
-        </w:rPr>
-      </w:pPr>
-      <w:r>
-        <w:rPr>
-          <w:rFonts w:ascii="Arial" w:hAnsi="Arial"/>
-          <w:b/>
-          <w:bCs/>
-          <w:lang w:val="en-US"/>
-        </w:rPr>
-        <w:t>Internship Experience</w:t>
-      </w:r>
-    </w:p>
-    <w:p>
-      <w:pPr>
-        <w:pStyle w:val="BodyA"/>
-        <w:jc w:val="center"/>
-        <w:rPr>
           <w:rFonts w:ascii="Arial" w:hAnsi="Arial" w:eastAsia="Arial" w:cs="Arial"/>
-          <w:b/>
           <w:b/>
           <w:bCs/>
           <w:lang w:val="en-US"/>
@@ -1203,7 +1197,6 @@
         <w:pStyle w:val="BodyA"/>
         <w:rPr>
           <w:rFonts w:ascii="Arial" w:hAnsi="Arial" w:eastAsia="Arial" w:cs="Arial"/>
-          <w:b/>
           <w:b/>
           <w:bCs/>
         </w:rPr>
@@ -1268,7 +1261,7 @@
           <w:ilvl w:val="0"/>
           <w:numId w:val="1"/>
         </w:numPr>
-        <w:ind w:left="720" w:right="0" w:hanging="360"/>
+        <w:ind w:hanging="360" w:left="720" w:right="0"/>
         <w:rPr/>
       </w:pPr>
       <w:r>
@@ -1276,7 +1269,7 @@
           <w:rFonts w:ascii="Arial" w:hAnsi="Arial"/>
           <w:lang w:val="en-US"/>
         </w:rPr>
-        <w:t xml:space="preserve">Provided phone support </w:t>
+        <w:t>Provided phone and email support to customers.</w:t>
       </w:r>
     </w:p>
     <w:p>
@@ -1286,7 +1279,7 @@
           <w:ilvl w:val="0"/>
           <w:numId w:val="1"/>
         </w:numPr>
-        <w:ind w:left="720" w:right="0" w:hanging="360"/>
+        <w:ind w:hanging="360" w:left="720" w:right="0"/>
         <w:rPr/>
       </w:pPr>
       <w:r>
@@ -1294,7 +1287,7 @@
           <w:rFonts w:ascii="Arial" w:hAnsi="Arial"/>
           <w:lang w:val="en-US"/>
         </w:rPr>
-        <w:t>Email Support</w:t>
+        <w:t>Assisted with development tasks using C# and SQL.</w:t>
       </w:r>
     </w:p>
     <w:p>
@@ -1304,7 +1297,7 @@
           <w:ilvl w:val="0"/>
           <w:numId w:val="1"/>
         </w:numPr>
-        <w:ind w:left="720" w:right="0" w:hanging="360"/>
+        <w:ind w:hanging="360" w:left="720" w:right="0"/>
         <w:rPr/>
       </w:pPr>
       <w:r>
@@ -1312,27 +1305,7 @@
           <w:rFonts w:ascii="Arial" w:hAnsi="Arial"/>
           <w:lang w:val="en-US"/>
         </w:rPr>
-        <w:t>Involved with C# and SQL programming</w:t>
-      </w:r>
-    </w:p>
-    <w:p>
-      <w:pPr>
-        <w:pStyle w:val="BodyA"/>
-        <w:numPr>
-          <w:ilvl w:val="0"/>
-          <w:numId w:val="1"/>
-        </w:numPr>
-        <w:ind w:left="720" w:right="0" w:hanging="360"/>
-        <w:rPr>
-          <w:rFonts w:ascii="Arial" w:hAnsi="Arial"/>
-        </w:rPr>
-      </w:pPr>
-      <w:r>
-        <w:rPr>
-          <w:rFonts w:ascii="Arial" w:hAnsi="Arial"/>
-          <w:lang w:val="en-US"/>
-        </w:rPr>
-        <w:t>Conducted duties as assigned to be an effective team member</w:t>
+        <w:t>Supported team operations and completed assigned technical tasks.</w:t>
       </w:r>
     </w:p>
     <w:p>
@@ -1400,7 +1373,7 @@
           <w:ilvl w:val="0"/>
           <w:numId w:val="3"/>
         </w:numPr>
-        <w:ind w:left="720" w:right="0" w:hanging="360"/>
+        <w:ind w:hanging="360" w:left="720" w:right="0"/>
         <w:jc w:val="left"/>
         <w:rPr/>
       </w:pPr>
@@ -1409,14 +1382,7 @@
           <w:rFonts w:ascii="Arial" w:hAnsi="Arial"/>
           <w:lang w:val="en-US"/>
         </w:rPr>
-        <w:t xml:space="preserve"> </w:t>
-      </w:r>
-      <w:r>
-        <w:rPr>
-          <w:rFonts w:ascii="Arial" w:hAnsi="Arial"/>
-          <w:lang w:val="en-US"/>
-        </w:rPr>
-        <w:t>Provided project support in software development including program to transfer electronic health records data to standardized forms for physician’s office</w:t>
+        <w:t>Contributed to software development projects, including tools for electronic health record data transfer.</w:t>
       </w:r>
     </w:p>
     <w:p>
@@ -1426,48 +1392,27 @@
           <w:ilvl w:val="0"/>
           <w:numId w:val="3"/>
         </w:numPr>
-        <w:ind w:left="720" w:right="0" w:hanging="360"/>
+        <w:ind w:hanging="360" w:left="720" w:right="0"/>
         <w:jc w:val="left"/>
-        <w:rPr>
-          <w:rFonts w:ascii="Arial" w:hAnsi="Arial"/>
-        </w:rPr>
-      </w:pPr>
-      <w:r>
-        <w:rPr>
-          <w:rFonts w:ascii="Arial" w:hAnsi="Arial"/>
-          <w:lang w:val="en-US"/>
-        </w:rPr>
-        <w:t>Utilized C#</w:t>
-      </w:r>
-    </w:p>
-    <w:p>
-      <w:pPr>
-        <w:pStyle w:val="Body"/>
-        <w:rPr>
-          <w:rFonts w:ascii="Arial" w:hAnsi="Arial" w:eastAsia="Arial" w:cs="Arial"/>
-        </w:rPr>
-      </w:pPr>
-      <w:r>
-        <w:rPr>
-          <w:rFonts w:eastAsia="Arial" w:cs="Arial" w:ascii="Arial" w:hAnsi="Arial"/>
-        </w:rPr>
-      </w:r>
-      <w:r>
-        <w:br w:type="page"/>
-      </w:r>
-    </w:p>
-    <w:p>
-      <w:pPr>
-        <w:pStyle w:val="Body"/>
-        <w:spacing w:before="0" w:after="0"/>
-        <w:rPr>
-          <w:rFonts w:ascii="Arial" w:hAnsi="Arial" w:eastAsia="Arial" w:cs="Arial"/>
-        </w:rPr>
-      </w:pPr>
-      <w:r>
-        <w:rPr>
-          <w:rFonts w:eastAsia="Arial" w:cs="Arial" w:ascii="Arial" w:hAnsi="Arial"/>
-        </w:rPr>
+        <w:rPr/>
+      </w:pPr>
+      <w:r>
+        <w:rPr>
+          <w:rFonts w:ascii="Arial" w:hAnsi="Arial"/>
+          <w:lang w:val="en-US"/>
+        </w:rPr>
+        <w:t>Utilized C# for development and automation tasks.</w:t>
+      </w:r>
+    </w:p>
+    <w:p>
+      <w:pPr>
+        <w:pStyle w:val="BodyA"/>
+        <w:rPr>
+          <w:rFonts w:ascii="Arial" w:hAnsi="Arial"/>
+        </w:rPr>
+      </w:pPr>
+      <w:r>
+        <w:rPr/>
       </w:r>
     </w:p>
     <w:p>
@@ -1546,23 +1491,18 @@
           <w:ilvl w:val="0"/>
           <w:numId w:val="4"/>
         </w:numPr>
-        <w:ind w:left="720" w:right="0" w:hanging="360"/>
+        <w:ind w:hanging="360" w:left="720" w:right="0"/>
         <w:jc w:val="left"/>
         <w:rPr/>
       </w:pPr>
       <w:r>
         <w:rPr>
           <w:rFonts w:ascii="Arial" w:hAnsi="Arial"/>
-          <w:lang w:val="en-US"/>
-        </w:rPr>
-        <w:t xml:space="preserve"> </w:t>
-      </w:r>
-      <w:r>
-        <w:rPr>
-          <w:rFonts w:ascii="Arial" w:hAnsi="Arial"/>
-          <w:lang w:val="en-US"/>
-        </w:rPr>
-        <w:t>Assisted Information Technology department to update software on teachers’ computers and repaired students’ I-pads</w:t>
+          <w:b w:val="false"/>
+          <w:bCs w:val="false"/>
+          <w:lang w:val="en-US"/>
+        </w:rPr>
+        <w:t>Updated software on teacher devices and repaired student iPads.</w:t>
       </w:r>
     </w:p>
     <w:p>
@@ -1572,31 +1512,27 @@
           <w:ilvl w:val="0"/>
           <w:numId w:val="4"/>
         </w:numPr>
-        <w:ind w:left="720" w:right="0" w:hanging="360"/>
+        <w:ind w:hanging="360" w:left="720" w:right="0"/>
         <w:jc w:val="left"/>
-        <w:rPr>
-          <w:b w:val="false"/>
+        <w:rPr/>
+      </w:pPr>
+      <w:r>
+        <w:rPr>
+          <w:rFonts w:ascii="Arial" w:hAnsi="Arial"/>
           <w:b w:val="false"/>
           <w:bCs w:val="false"/>
-        </w:rPr>
-      </w:pPr>
-      <w:r>
-        <w:rPr>
-          <w:rFonts w:ascii="Arial" w:hAnsi="Arial"/>
-          <w:b w:val="false"/>
-          <w:bCs w:val="false"/>
-          <w:lang w:val="en-US"/>
-        </w:rPr>
-        <w:t>Went to different locations to repair staff equipment</w:t>
+          <w:lang w:val="en-US"/>
+        </w:rPr>
+        <w:t>Traveled to school sites to troubleshoot and repair staff equipment.</w:t>
       </w:r>
     </w:p>
     <w:sectPr>
-      <w:headerReference w:type="even" r:id="rId2"/>
-      <w:headerReference w:type="default" r:id="rId3"/>
-      <w:headerReference w:type="first" r:id="rId4"/>
-      <w:footerReference w:type="even" r:id="rId5"/>
-      <w:footerReference w:type="default" r:id="rId6"/>
-      <w:footerReference w:type="first" r:id="rId7"/>
+      <w:headerReference w:type="even" r:id="rId3"/>
+      <w:headerReference w:type="default" r:id="rId4"/>
+      <w:headerReference w:type="first" r:id="rId5"/>
+      <w:footerReference w:type="even" r:id="rId6"/>
+      <w:footerReference w:type="default" r:id="rId7"/>
+      <w:footerReference w:type="first" r:id="rId8"/>
       <w:type w:val="nextPage"/>
       <w:pgSz w:w="12240" w:h="15840"/>
       <w:pgMar w:left="1440" w:right="1440" w:gutter="0" w:header="720" w:top="1152" w:footer="720" w:bottom="1440"/>
@@ -1696,7 +1632,43 @@
       </w:rPr>
     </w:pPr>
     <w:r>
-      <w:rPr/>
+      <w:rPr>
+        <w:rFonts w:ascii="Arial" w:hAnsi="Arial"/>
+        <w:lang w:val="en-US"/>
+      </w:rPr>
+      <w:t>40 S Slator Ave</w:t>
+    </w:r>
+  </w:p>
+  <w:p>
+    <w:pPr>
+      <w:pStyle w:val="BodyA"/>
+      <w:jc w:val="center"/>
+      <w:rPr>
+        <w:rFonts w:ascii="Arial" w:hAnsi="Arial"/>
+      </w:rPr>
+    </w:pPr>
+    <w:r>
+      <w:rPr>
+        <w:rFonts w:ascii="Arial" w:hAnsi="Arial"/>
+        <w:lang w:val="en-US"/>
+      </w:rPr>
+      <w:t>Inverness, FL 34453</w:t>
+    </w:r>
+  </w:p>
+  <w:p>
+    <w:pPr>
+      <w:pStyle w:val="BodyA"/>
+      <w:jc w:val="center"/>
+      <w:rPr>
+        <w:rFonts w:ascii="Arial" w:hAnsi="Arial"/>
+      </w:rPr>
+    </w:pPr>
+    <w:r>
+      <w:rPr>
+        <w:rFonts w:ascii="Arial" w:hAnsi="Arial"/>
+        <w:lang w:val="en-US"/>
+      </w:rPr>
+      <w:t>www.JoshuaTrono.com</w:t>
     </w:r>
   </w:p>
   <w:p>
@@ -1731,7 +1703,11 @@
       </w:rPr>
     </w:pPr>
     <w:r>
-      <w:rPr/>
+      <w:rPr>
+        <w:rFonts w:ascii="Arial" w:hAnsi="Arial"/>
+        <w:lang w:val="en-US"/>
+      </w:rPr>
+      <w:t>(352) 464-1928</w:t>
     </w:r>
   </w:p>
 </w:hdr>
@@ -1768,7 +1744,43 @@
       </w:rPr>
     </w:pPr>
     <w:r>
-      <w:rPr/>
+      <w:rPr>
+        <w:rFonts w:ascii="Arial" w:hAnsi="Arial"/>
+        <w:lang w:val="en-US"/>
+      </w:rPr>
+      <w:t>40 S Slator Ave</w:t>
+    </w:r>
+  </w:p>
+  <w:p>
+    <w:pPr>
+      <w:pStyle w:val="BodyA"/>
+      <w:jc w:val="center"/>
+      <w:rPr>
+        <w:rFonts w:ascii="Arial" w:hAnsi="Arial"/>
+      </w:rPr>
+    </w:pPr>
+    <w:r>
+      <w:rPr>
+        <w:rFonts w:ascii="Arial" w:hAnsi="Arial"/>
+        <w:lang w:val="en-US"/>
+      </w:rPr>
+      <w:t>Inverness, FL 34453</w:t>
+    </w:r>
+  </w:p>
+  <w:p>
+    <w:pPr>
+      <w:pStyle w:val="BodyA"/>
+      <w:jc w:val="center"/>
+      <w:rPr>
+        <w:rFonts w:ascii="Arial" w:hAnsi="Arial"/>
+      </w:rPr>
+    </w:pPr>
+    <w:r>
+      <w:rPr>
+        <w:rFonts w:ascii="Arial" w:hAnsi="Arial"/>
+        <w:lang w:val="en-US"/>
+      </w:rPr>
+      <w:t>www.JoshuaTrono.com</w:t>
     </w:r>
   </w:p>
   <w:p>
@@ -1803,7 +1815,11 @@
       </w:rPr>
     </w:pPr>
     <w:r>
-      <w:rPr/>
+      <w:rPr>
+        <w:rFonts w:ascii="Arial" w:hAnsi="Arial"/>
+        <w:lang w:val="en-US"/>
+      </w:rPr>
+      <w:t>(352) 464-1928</w:t>
     </w:r>
   </w:p>
 </w:hdr>
@@ -1814,6 +1830,7 @@
   <w:abstractNum w:abstractNumId="1">
     <w:lvl w:ilvl="0">
       <w:start w:val="1"/>
+      <w:isLgl/>
       <w:numFmt w:val="bullet"/>
       <w:lvlText w:val=""/>
       <w:lvlJc w:val="left"/>
@@ -1829,6 +1846,7 @@
     </w:lvl>
     <w:lvl w:ilvl="1">
       <w:start w:val="1"/>
+      <w:isLgl/>
       <w:numFmt w:val="bullet"/>
       <w:lvlText w:val="o"/>
       <w:lvlJc w:val="left"/>
@@ -1857,6 +1875,7 @@
     </w:lvl>
     <w:lvl w:ilvl="2">
       <w:start w:val="1"/>
+      <w:isLgl/>
       <w:numFmt w:val="bullet"/>
       <w:lvlText w:val="▪"/>
       <w:lvlJc w:val="left"/>
@@ -1885,6 +1904,7 @@
     </w:lvl>
     <w:lvl w:ilvl="3">
       <w:start w:val="1"/>
+      <w:isLgl/>
       <w:numFmt w:val="bullet"/>
       <w:lvlText w:val="·"/>
       <w:lvlJc w:val="left"/>
@@ -1913,6 +1933,7 @@
     </w:lvl>
     <w:lvl w:ilvl="4">
       <w:start w:val="1"/>
+      <w:isLgl/>
       <w:numFmt w:val="bullet"/>
       <w:lvlText w:val="o"/>
       <w:lvlJc w:val="left"/>
@@ -1941,6 +1962,7 @@
     </w:lvl>
     <w:lvl w:ilvl="5">
       <w:start w:val="1"/>
+      <w:isLgl/>
       <w:numFmt w:val="bullet"/>
       <w:lvlText w:val="▪"/>
       <w:lvlJc w:val="left"/>
@@ -1969,6 +1991,7 @@
     </w:lvl>
     <w:lvl w:ilvl="6">
       <w:start w:val="1"/>
+      <w:isLgl/>
       <w:numFmt w:val="bullet"/>
       <w:lvlText w:val="·"/>
       <w:lvlJc w:val="left"/>
@@ -1997,6 +2020,7 @@
     </w:lvl>
     <w:lvl w:ilvl="7">
       <w:start w:val="1"/>
+      <w:isLgl/>
       <w:numFmt w:val="bullet"/>
       <w:lvlText w:val="o"/>
       <w:lvlJc w:val="left"/>
@@ -2025,6 +2049,7 @@
     </w:lvl>
     <w:lvl w:ilvl="8">
       <w:start w:val="1"/>
+      <w:isLgl/>
       <w:numFmt w:val="bullet"/>
       <w:lvlText w:val="▪"/>
       <w:lvlJc w:val="left"/>
@@ -2055,6 +2080,7 @@
   <w:abstractNum w:abstractNumId="2">
     <w:lvl w:ilvl="0">
       <w:start w:val="1"/>
+      <w:isLgl/>
       <w:numFmt w:val="bullet"/>
       <w:lvlText w:val=""/>
       <w:lvlJc w:val="left"/>
@@ -2070,6 +2096,7 @@
     </w:lvl>
     <w:lvl w:ilvl="1">
       <w:start w:val="1"/>
+      <w:isLgl/>
       <w:numFmt w:val="bullet"/>
       <w:lvlText w:val=""/>
       <w:lvlJc w:val="left"/>
@@ -2085,6 +2112,7 @@
     </w:lvl>
     <w:lvl w:ilvl="2">
       <w:start w:val="1"/>
+      <w:isLgl/>
       <w:numFmt w:val="bullet"/>
       <w:lvlText w:val=""/>
       <w:lvlJc w:val="left"/>
@@ -2100,6 +2128,7 @@
     </w:lvl>
     <w:lvl w:ilvl="3">
       <w:start w:val="1"/>
+      <w:isLgl/>
       <w:numFmt w:val="bullet"/>
       <w:lvlText w:val=""/>
       <w:lvlJc w:val="left"/>
@@ -2115,6 +2144,7 @@
     </w:lvl>
     <w:lvl w:ilvl="4">
       <w:start w:val="1"/>
+      <w:isLgl/>
       <w:numFmt w:val="bullet"/>
       <w:lvlText w:val=""/>
       <w:lvlJc w:val="left"/>
@@ -2130,6 +2160,7 @@
     </w:lvl>
     <w:lvl w:ilvl="5">
       <w:start w:val="1"/>
+      <w:isLgl/>
       <w:numFmt w:val="bullet"/>
       <w:lvlText w:val=""/>
       <w:lvlJc w:val="left"/>
@@ -2145,6 +2176,7 @@
     </w:lvl>
     <w:lvl w:ilvl="6">
       <w:start w:val="1"/>
+      <w:isLgl/>
       <w:numFmt w:val="bullet"/>
       <w:lvlText w:val=""/>
       <w:lvlJc w:val="left"/>
@@ -2160,6 +2192,7 @@
     </w:lvl>
     <w:lvl w:ilvl="7">
       <w:start w:val="1"/>
+      <w:isLgl/>
       <w:numFmt w:val="bullet"/>
       <w:lvlText w:val=""/>
       <w:lvlJc w:val="left"/>
@@ -2175,6 +2208,7 @@
     </w:lvl>
     <w:lvl w:ilvl="8">
       <w:start w:val="1"/>
+      <w:isLgl/>
       <w:numFmt w:val="bullet"/>
       <w:lvlText w:val=""/>
       <w:lvlJc w:val="left"/>
@@ -2192,6 +2226,7 @@
   <w:abstractNum w:abstractNumId="3">
     <w:lvl w:ilvl="0">
       <w:start w:val="1"/>
+      <w:isLgl/>
       <w:numFmt w:val="bullet"/>
       <w:lvlText w:val=""/>
       <w:lvlJc w:val="left"/>
@@ -2207,6 +2242,7 @@
     </w:lvl>
     <w:lvl w:ilvl="1">
       <w:start w:val="1"/>
+      <w:isLgl/>
       <w:numFmt w:val="bullet"/>
       <w:lvlText w:val="o"/>
       <w:lvlJc w:val="left"/>
@@ -2222,6 +2258,7 @@
     </w:lvl>
     <w:lvl w:ilvl="2">
       <w:start w:val="1"/>
+      <w:isLgl/>
       <w:numFmt w:val="bullet"/>
       <w:lvlText w:val="§"/>
       <w:lvlJc w:val="left"/>
@@ -2237,6 +2274,7 @@
     </w:lvl>
     <w:lvl w:ilvl="3">
       <w:start w:val="1"/>
+      <w:isLgl/>
       <w:numFmt w:val="bullet"/>
       <w:lvlText w:val="·"/>
       <w:lvlJc w:val="left"/>
@@ -2252,6 +2290,7 @@
     </w:lvl>
     <w:lvl w:ilvl="4">
       <w:start w:val="1"/>
+      <w:isLgl/>
       <w:numFmt w:val="bullet"/>
       <w:lvlText w:val="o"/>
       <w:lvlJc w:val="left"/>
@@ -2267,6 +2306,7 @@
     </w:lvl>
     <w:lvl w:ilvl="5">
       <w:start w:val="1"/>
+      <w:isLgl/>
       <w:numFmt w:val="bullet"/>
       <w:lvlText w:val="§"/>
       <w:lvlJc w:val="left"/>
@@ -2282,6 +2322,7 @@
     </w:lvl>
     <w:lvl w:ilvl="6">
       <w:start w:val="1"/>
+      <w:isLgl/>
       <w:numFmt w:val="bullet"/>
       <w:lvlText w:val="·"/>
       <w:lvlJc w:val="left"/>
@@ -2297,6 +2338,7 @@
     </w:lvl>
     <w:lvl w:ilvl="7">
       <w:start w:val="1"/>
+      <w:isLgl/>
       <w:numFmt w:val="bullet"/>
       <w:lvlText w:val="o"/>
       <w:lvlJc w:val="left"/>
@@ -2312,6 +2354,7 @@
     </w:lvl>
     <w:lvl w:ilvl="8">
       <w:start w:val="1"/>
+      <w:isLgl/>
       <w:numFmt w:val="bullet"/>
       <w:lvlText w:val="§"/>
       <w:lvlJc w:val="left"/>
@@ -2329,6 +2372,7 @@
   <w:abstractNum w:abstractNumId="4">
     <w:lvl w:ilvl="0">
       <w:start w:val="1"/>
+      <w:isLgl/>
       <w:numFmt w:val="bullet"/>
       <w:lvlText w:val=""/>
       <w:lvlJc w:val="left"/>
@@ -2344,6 +2388,7 @@
     </w:lvl>
     <w:lvl w:ilvl="1">
       <w:start w:val="1"/>
+      <w:isLgl/>
       <w:numFmt w:val="bullet"/>
       <w:lvlText w:val="o"/>
       <w:lvlJc w:val="left"/>
@@ -2359,6 +2404,7 @@
     </w:lvl>
     <w:lvl w:ilvl="2">
       <w:start w:val="1"/>
+      <w:isLgl/>
       <w:numFmt w:val="bullet"/>
       <w:lvlText w:val="§"/>
       <w:lvlJc w:val="left"/>
@@ -2374,6 +2420,7 @@
     </w:lvl>
     <w:lvl w:ilvl="3">
       <w:start w:val="1"/>
+      <w:isLgl/>
       <w:numFmt w:val="bullet"/>
       <w:lvlText w:val="·"/>
       <w:lvlJc w:val="left"/>
@@ -2389,6 +2436,7 @@
     </w:lvl>
     <w:lvl w:ilvl="4">
       <w:start w:val="1"/>
+      <w:isLgl/>
       <w:numFmt w:val="bullet"/>
       <w:lvlText w:val="o"/>
       <w:lvlJc w:val="left"/>
@@ -2404,6 +2452,7 @@
     </w:lvl>
     <w:lvl w:ilvl="5">
       <w:start w:val="1"/>
+      <w:isLgl/>
       <w:numFmt w:val="bullet"/>
       <w:lvlText w:val="§"/>
       <w:lvlJc w:val="left"/>
@@ -2419,6 +2468,7 @@
     </w:lvl>
     <w:lvl w:ilvl="6">
       <w:start w:val="1"/>
+      <w:isLgl/>
       <w:numFmt w:val="bullet"/>
       <w:lvlText w:val="·"/>
       <w:lvlJc w:val="left"/>
@@ -2434,6 +2484,7 @@
     </w:lvl>
     <w:lvl w:ilvl="7">
       <w:start w:val="1"/>
+      <w:isLgl/>
       <w:numFmt w:val="bullet"/>
       <w:lvlText w:val="o"/>
       <w:lvlJc w:val="left"/>
@@ -2449,6 +2500,7 @@
     </w:lvl>
     <w:lvl w:ilvl="8">
       <w:start w:val="1"/>
+      <w:isLgl/>
       <w:numFmt w:val="bullet"/>
       <w:lvlText w:val="§"/>
       <w:lvlJc w:val="left"/>
@@ -2466,6 +2518,7 @@
   <w:abstractNum w:abstractNumId="5">
     <w:lvl w:ilvl="0">
       <w:start w:val="1"/>
+      <w:isLgl/>
       <w:numFmt w:val="bullet"/>
       <w:lvlText w:val=""/>
       <w:lvlJc w:val="left"/>
@@ -2481,6 +2534,7 @@
     </w:lvl>
     <w:lvl w:ilvl="1">
       <w:start w:val="1"/>
+      <w:isLgl/>
       <w:numFmt w:val="bullet"/>
       <w:lvlText w:val="o"/>
       <w:lvlJc w:val="left"/>
@@ -2496,6 +2550,7 @@
     </w:lvl>
     <w:lvl w:ilvl="2">
       <w:start w:val="1"/>
+      <w:isLgl/>
       <w:numFmt w:val="bullet"/>
       <w:lvlText w:val="§"/>
       <w:lvlJc w:val="left"/>
@@ -2511,6 +2566,7 @@
     </w:lvl>
     <w:lvl w:ilvl="3">
       <w:start w:val="1"/>
+      <w:isLgl/>
       <w:numFmt w:val="bullet"/>
       <w:lvlText w:val="·"/>
       <w:lvlJc w:val="left"/>
@@ -2526,6 +2582,7 @@
     </w:lvl>
     <w:lvl w:ilvl="4">
       <w:start w:val="1"/>
+      <w:isLgl/>
       <w:numFmt w:val="bullet"/>
       <w:lvlText w:val="o"/>
       <w:lvlJc w:val="left"/>
@@ -2541,6 +2598,7 @@
     </w:lvl>
     <w:lvl w:ilvl="5">
       <w:start w:val="1"/>
+      <w:isLgl/>
       <w:numFmt w:val="bullet"/>
       <w:lvlText w:val="§"/>
       <w:lvlJc w:val="left"/>
@@ -2556,6 +2614,7 @@
     </w:lvl>
     <w:lvl w:ilvl="6">
       <w:start w:val="1"/>
+      <w:isLgl/>
       <w:numFmt w:val="bullet"/>
       <w:lvlText w:val="·"/>
       <w:lvlJc w:val="left"/>
@@ -2571,6 +2630,7 @@
     </w:lvl>
     <w:lvl w:ilvl="7">
       <w:start w:val="1"/>
+      <w:isLgl/>
       <w:numFmt w:val="bullet"/>
       <w:lvlText w:val="o"/>
       <w:lvlJc w:val="left"/>
@@ -2586,6 +2646,7 @@
     </w:lvl>
     <w:lvl w:ilvl="8">
       <w:start w:val="1"/>
+      <w:isLgl/>
       <w:numFmt w:val="bullet"/>
       <w:lvlText w:val="§"/>
       <w:lvlJc w:val="left"/>
@@ -2603,6 +2664,7 @@
   <w:abstractNum w:abstractNumId="6">
     <w:lvl w:ilvl="0">
       <w:start w:val="1"/>
+      <w:isLgl/>
       <w:numFmt w:val="bullet"/>
       <w:lvlText w:val=""/>
       <w:lvlJc w:val="left"/>
@@ -2618,6 +2680,7 @@
     </w:lvl>
     <w:lvl w:ilvl="1">
       <w:start w:val="1"/>
+      <w:isLgl/>
       <w:numFmt w:val="bullet"/>
       <w:lvlText w:val="o"/>
       <w:lvlJc w:val="left"/>
@@ -2633,6 +2696,7 @@
     </w:lvl>
     <w:lvl w:ilvl="2">
       <w:start w:val="1"/>
+      <w:isLgl/>
       <w:numFmt w:val="bullet"/>
       <w:lvlText w:val="§"/>
       <w:lvlJc w:val="left"/>
@@ -2648,6 +2712,7 @@
     </w:lvl>
     <w:lvl w:ilvl="3">
       <w:start w:val="1"/>
+      <w:isLgl/>
       <w:numFmt w:val="bullet"/>
       <w:lvlText w:val="·"/>
       <w:lvlJc w:val="left"/>
@@ -2663,6 +2728,7 @@
     </w:lvl>
     <w:lvl w:ilvl="4">
       <w:start w:val="1"/>
+      <w:isLgl/>
       <w:numFmt w:val="bullet"/>
       <w:lvlText w:val="o"/>
       <w:lvlJc w:val="left"/>
@@ -2678,6 +2744,7 @@
     </w:lvl>
     <w:lvl w:ilvl="5">
       <w:start w:val="1"/>
+      <w:isLgl/>
       <w:numFmt w:val="bullet"/>
       <w:lvlText w:val="§"/>
       <w:lvlJc w:val="left"/>
@@ -2693,6 +2760,7 @@
     </w:lvl>
     <w:lvl w:ilvl="6">
       <w:start w:val="1"/>
+      <w:isLgl/>
       <w:numFmt w:val="bullet"/>
       <w:lvlText w:val="·"/>
       <w:lvlJc w:val="left"/>
@@ -2708,6 +2776,7 @@
     </w:lvl>
     <w:lvl w:ilvl="7">
       <w:start w:val="1"/>
+      <w:isLgl/>
       <w:numFmt w:val="bullet"/>
       <w:lvlText w:val="o"/>
       <w:lvlJc w:val="left"/>
@@ -2723,6 +2792,7 @@
     </w:lvl>
     <w:lvl w:ilvl="8">
       <w:start w:val="1"/>
+      <w:isLgl/>
       <w:numFmt w:val="bullet"/>
       <w:lvlText w:val="§"/>
       <w:lvlJc w:val="left"/>
@@ -3875,7 +3945,7 @@
       <w:vertAlign w:val="superscript"/>
     </w:rPr>
   </w:style>
-  <w:style w:type="character" w:styleId="FootnoteAnchor">
+  <w:style w:type="character" w:styleId="FootnoteReference">
     <w:name w:val="Footnote Reference"/>
     <w:rPr>
       <w:vertAlign w:val="superscript"/>
@@ -3941,7 +4011,7 @@
       <w:vertAlign w:val="superscript"/>
     </w:rPr>
   </w:style>
-  <w:style w:type="character" w:styleId="EndnoteAnchor">
+  <w:style w:type="character" w:styleId="EndnoteReference">
     <w:name w:val="Endnote Reference"/>
     <w:rPr>
       <w:vertAlign w:val="superscript"/>
@@ -3952,7 +4022,7 @@
     <w:qFormat/>
     <w:rPr/>
   </w:style>
-  <w:style w:type="character" w:styleId="InternetLink">
+  <w:style w:type="character" w:styleId="Hyperlink">
     <w:name w:val="Hyperlink"/>
     <w:rPr>
       <w:u w:val="single"/>
@@ -3968,7 +4038,7 @@
   <w:style w:type="paragraph" w:styleId="Heading">
     <w:name w:val="Heading"/>
     <w:basedOn w:val="Normal"/>
-    <w:next w:val="TextBody"/>
+    <w:next w:val="BodyText"/>
     <w:qFormat/>
     <w:pPr>
       <w:keepNext w:val="true"/>
@@ -3980,7 +4050,7 @@
       <w:szCs w:val="28"/>
     </w:rPr>
   </w:style>
-  <w:style w:type="paragraph" w:styleId="TextBody">
+  <w:style w:type="paragraph" w:styleId="BodyText">
     <w:name w:val="Body Text"/>
     <w:basedOn w:val="Normal"/>
     <w:pPr>
@@ -3990,7 +4060,7 @@
   </w:style>
   <w:style w:type="paragraph" w:styleId="List">
     <w:name w:val="List"/>
-    <w:basedOn w:val="TextBody"/>
+    <w:basedOn w:val="BodyText"/>
     <w:pPr/>
     <w:rPr>
       <w:rFonts w:cs="Noto Sans Devanagari"/>
@@ -4009,7 +4079,7 @@
     <w:rPr>
       <w:b/>
       <w:bCs/>
-      <w:color w:val="4F81BD" w:themeColor="accent1"/>
+      <w:color w:themeColor="accent1" w:val="4F81BD"/>
       <w:sz w:val="18"/>
       <w:szCs w:val="18"/>
     </w:rPr>
@@ -4079,7 +4149,7 @@
     <w:uiPriority w:val="29"/>
     <w:qFormat/>
     <w:pPr>
-      <w:ind w:left="720" w:right="720" w:hanging="0"/>
+      <w:ind w:left="720" w:right="720"/>
     </w:pPr>
     <w:rPr>
       <w:i/>
@@ -4099,7 +4169,7 @@
       </w:pBdr>
       <w:shd w:val="clear" w:color="auto" w:fill="F2F2F2"/>
       <w:spacing w:before="0" w:after="0"/>
-      <w:ind w:left="720" w:right="720" w:hanging="0"/>
+      <w:ind w:left="720" w:right="720"/>
     </w:pPr>
     <w:rPr>
       <w:i/>
@@ -4142,7 +4212,7 @@
     </w:pPr>
     <w:rPr/>
   </w:style>
-  <w:style w:type="paragraph" w:styleId="Footnote">
+  <w:style w:type="paragraph" w:styleId="FootnoteText">
     <w:name w:val="Footnote Text"/>
     <w:basedOn w:val="Normal"/>
     <w:uiPriority w:val="99"/>
@@ -4155,7 +4225,7 @@
       <w:sz w:val="18"/>
     </w:rPr>
   </w:style>
-  <w:style w:type="paragraph" w:styleId="Endnote">
+  <w:style w:type="paragraph" w:styleId="EndnoteText">
     <w:name w:val="Endnote Text"/>
     <w:basedOn w:val="Normal"/>
     <w:uiPriority w:val="99"/>
@@ -4168,102 +4238,102 @@
       <w:sz w:val="20"/>
     </w:rPr>
   </w:style>
-  <w:style w:type="paragraph" w:styleId="Contents1">
+  <w:style w:type="paragraph" w:styleId="TOC1">
     <w:name w:val="TOC 1"/>
     <w:basedOn w:val="Normal"/>
     <w:uiPriority w:val="39"/>
     <w:unhideWhenUsed/>
     <w:pPr>
       <w:spacing w:before="0" w:after="57"/>
-      <w:ind w:left="0" w:right="0" w:hanging="0"/>
+      <w:ind w:hanging="0" w:left="0" w:right="0"/>
     </w:pPr>
     <w:rPr/>
   </w:style>
-  <w:style w:type="paragraph" w:styleId="Contents2">
+  <w:style w:type="paragraph" w:styleId="TOC2">
     <w:name w:val="TOC 2"/>
     <w:basedOn w:val="Normal"/>
     <w:uiPriority w:val="39"/>
     <w:unhideWhenUsed/>
     <w:pPr>
       <w:spacing w:before="0" w:after="57"/>
-      <w:ind w:left="283" w:right="0" w:hanging="0"/>
+      <w:ind w:hanging="0" w:left="283" w:right="0"/>
     </w:pPr>
     <w:rPr/>
   </w:style>
-  <w:style w:type="paragraph" w:styleId="Contents3">
+  <w:style w:type="paragraph" w:styleId="TOC3">
     <w:name w:val="TOC 3"/>
     <w:basedOn w:val="Normal"/>
     <w:uiPriority w:val="39"/>
     <w:unhideWhenUsed/>
     <w:pPr>
       <w:spacing w:before="0" w:after="57"/>
-      <w:ind w:left="567" w:right="0" w:hanging="0"/>
+      <w:ind w:hanging="0" w:left="567" w:right="0"/>
     </w:pPr>
     <w:rPr/>
   </w:style>
-  <w:style w:type="paragraph" w:styleId="Contents4">
+  <w:style w:type="paragraph" w:styleId="TOC4">
     <w:name w:val="TOC 4"/>
     <w:basedOn w:val="Normal"/>
     <w:uiPriority w:val="39"/>
     <w:unhideWhenUsed/>
     <w:pPr>
       <w:spacing w:before="0" w:after="57"/>
-      <w:ind w:left="850" w:right="0" w:hanging="0"/>
+      <w:ind w:hanging="0" w:left="850" w:right="0"/>
     </w:pPr>
     <w:rPr/>
   </w:style>
-  <w:style w:type="paragraph" w:styleId="Contents5">
+  <w:style w:type="paragraph" w:styleId="TOC5">
     <w:name w:val="TOC 5"/>
     <w:basedOn w:val="Normal"/>
     <w:uiPriority w:val="39"/>
     <w:unhideWhenUsed/>
     <w:pPr>
       <w:spacing w:before="0" w:after="57"/>
-      <w:ind w:left="1134" w:right="0" w:hanging="0"/>
+      <w:ind w:hanging="0" w:left="1134" w:right="0"/>
     </w:pPr>
     <w:rPr/>
   </w:style>
-  <w:style w:type="paragraph" w:styleId="Contents6">
+  <w:style w:type="paragraph" w:styleId="TOC6">
     <w:name w:val="TOC 6"/>
     <w:basedOn w:val="Normal"/>
     <w:uiPriority w:val="39"/>
     <w:unhideWhenUsed/>
     <w:pPr>
       <w:spacing w:before="0" w:after="57"/>
-      <w:ind w:left="1417" w:right="0" w:hanging="0"/>
+      <w:ind w:hanging="0" w:left="1417" w:right="0"/>
     </w:pPr>
     <w:rPr/>
   </w:style>
-  <w:style w:type="paragraph" w:styleId="Contents7">
+  <w:style w:type="paragraph" w:styleId="TOC7">
     <w:name w:val="TOC 7"/>
     <w:basedOn w:val="Normal"/>
     <w:uiPriority w:val="39"/>
     <w:unhideWhenUsed/>
     <w:pPr>
       <w:spacing w:before="0" w:after="57"/>
-      <w:ind w:left="1701" w:right="0" w:hanging="0"/>
+      <w:ind w:hanging="0" w:left="1701" w:right="0"/>
     </w:pPr>
     <w:rPr/>
   </w:style>
-  <w:style w:type="paragraph" w:styleId="Contents8">
+  <w:style w:type="paragraph" w:styleId="TOC8">
     <w:name w:val="TOC 8"/>
     <w:basedOn w:val="Normal"/>
     <w:uiPriority w:val="39"/>
     <w:unhideWhenUsed/>
     <w:pPr>
       <w:spacing w:before="0" w:after="57"/>
-      <w:ind w:left="1984" w:right="0" w:hanging="0"/>
+      <w:ind w:hanging="0" w:left="1984" w:right="0"/>
     </w:pPr>
     <w:rPr/>
   </w:style>
-  <w:style w:type="paragraph" w:styleId="Contents9">
+  <w:style w:type="paragraph" w:styleId="TOC9">
     <w:name w:val="TOC 9"/>
     <w:basedOn w:val="Normal"/>
     <w:uiPriority w:val="39"/>
     <w:unhideWhenUsed/>
     <w:pPr>
       <w:spacing w:before="0" w:after="57"/>
-      <w:ind w:left="2268" w:right="0" w:hanging="0"/>
+      <w:ind w:hanging="0" w:left="2268" w:right="0"/>
     </w:pPr>
     <w:rPr/>
   </w:style>
@@ -4273,7 +4343,7 @@
     <w:pPr/>
     <w:rPr/>
   </w:style>
-  <w:style w:type="paragraph" w:styleId="ContentsHeading">
+  <w:style w:type="paragraph" w:styleId="TOCHeading">
     <w:name w:val="TOC Heading"/>
     <w:uiPriority w:val="39"/>
     <w:unhideWhenUsed/>
@@ -4300,7 +4370,6 @@
     <w:basedOn w:val="Normal"/>
     <w:uiPriority w:val="99"/>
     <w:unhideWhenUsed/>
-    <w:qFormat/>
     <w:pPr>
       <w:spacing w:before="0" w:afterAutospacing="0" w:after="0"/>
     </w:pPr>
@@ -4322,7 +4391,7 @@
       <w:suppressAutoHyphens w:val="true"/>
       <w:bidi w:val="0"/>
       <w:spacing w:lineRule="auto" w:line="240" w:before="0" w:after="0"/>
-      <w:ind w:left="0" w:right="0" w:hanging="0"/>
+      <w:ind w:hanging="0" w:left="0" w:right="0"/>
       <w:jc w:val="left"/>
     </w:pPr>
     <w:rPr>
@@ -4368,7 +4437,7 @@
       <w:suppressAutoHyphens w:val="true"/>
       <w:bidi w:val="0"/>
       <w:spacing w:lineRule="auto" w:line="240" w:before="0" w:after="0"/>
-      <w:ind w:left="0" w:right="0" w:hanging="0"/>
+      <w:ind w:hanging="0" w:left="0" w:right="0"/>
       <w:jc w:val="left"/>
     </w:pPr>
     <w:rPr>
@@ -4415,7 +4484,7 @@
       <w:suppressAutoHyphens w:val="true"/>
       <w:bidi w:val="0"/>
       <w:spacing w:lineRule="auto" w:line="240" w:before="0" w:after="0"/>
-      <w:ind w:left="720" w:right="0" w:hanging="0"/>
+      <w:ind w:hanging="0" w:left="720" w:right="0"/>
       <w:jc w:val="left"/>
     </w:pPr>
     <w:rPr>
@@ -4458,7 +4527,7 @@
       <w:suppressAutoHyphens w:val="true"/>
       <w:bidi w:val="0"/>
       <w:spacing w:lineRule="auto" w:line="240" w:before="0" w:after="0"/>
-      <w:ind w:left="0" w:right="0" w:hanging="0"/>
+      <w:ind w:hanging="0" w:left="0" w:right="0"/>
       <w:jc w:val="left"/>
     </w:pPr>
     <w:rPr>

</xml_diff>

<commit_message>
Deploying to gh-pages from  @ 1c84104b3350c207494312970e5efb34ed92da52 🚀
</commit_message>
<xml_diff>
--- a/images/Resume.docx
+++ b/images/Resume.docx
@@ -284,8 +284,6 @@
       <w:r>
         <w:rPr>
           <w:rFonts w:eastAsia="Arial" w:cs="Arial" w:ascii="Arial" w:hAnsi="Arial"/>
-          <w:b/>
-          <w:bCs/>
         </w:rPr>
       </w:r>
     </w:p>
@@ -1412,7 +1410,9 @@
         </w:rPr>
       </w:pPr>
       <w:r>
-        <w:rPr/>
+        <w:rPr>
+          <w:rFonts w:ascii="Arial" w:hAnsi="Arial"/>
+        </w:rPr>
       </w:r>
     </w:p>
     <w:p>
@@ -1531,11 +1531,10 @@
       <w:headerReference w:type="default" r:id="rId4"/>
       <w:headerReference w:type="first" r:id="rId5"/>
       <w:footerReference w:type="even" r:id="rId6"/>
-      <w:footerReference w:type="default" r:id="rId7"/>
-      <w:footerReference w:type="first" r:id="rId8"/>
+      <w:footerReference w:type="first" r:id="rId7"/>
       <w:type w:val="nextPage"/>
       <w:pgSz w:w="12240" w:h="15840"/>
-      <w:pgMar w:left="1440" w:right="1440" w:gutter="0" w:header="720" w:top="1152" w:footer="720" w:bottom="1440"/>
+      <w:pgMar w:left="1440" w:right="1440" w:gutter="0" w:header="720" w:top="1152" w:footer="0" w:bottom="720"/>
       <w:pgNumType w:fmt="decimal"/>
       <w:formProt w:val="false"/>
       <w:textDirection w:val="lrTb"/>
@@ -1560,31 +1559,7 @@
 </file>
 
 <file path=word/footer2.xml><?xml version="1.0" encoding="utf-8"?>
-<w:ftr xmlns:o="urn:schemas-microsoft-com:office:office" xmlns:r="http://schemas.openxmlformats.org/officeDocument/2006/relationships" xmlns:v="urn:schemas-microsoft-com:vml" xmlns:w="http://schemas.openxmlformats.org/wordprocessingml/2006/main" xmlns:w10="urn:schemas-microsoft-com:office:word" xmlns:wp="http://schemas.openxmlformats.org/drawingml/2006/wordprocessingDrawing" xmlns:wps="http://schemas.microsoft.com/office/word/2010/wordprocessingShape" xmlns:wpg="http://schemas.microsoft.com/office/word/2010/wordprocessingGroup" xmlns:mc="http://schemas.openxmlformats.org/markup-compatibility/2006" xmlns:wp14="http://schemas.microsoft.com/office/word/2010/wordprocessingDrawing" xmlns:w14="http://schemas.microsoft.com/office/word/2010/wordml" xmlns:w15="http://schemas.microsoft.com/office/word/2012/wordml" mc:Ignorable="w14 wp14 w15">
-  <w:p>
-    <w:pPr>
-      <w:pStyle w:val="HeaderFooter"/>
-      <w:rPr/>
-    </w:pPr>
-    <w:r>
-      <w:rPr/>
-    </w:r>
-  </w:p>
-</w:ftr>
-</file>
-
-<file path=word/footer3.xml><?xml version="1.0" encoding="utf-8"?>
-<w:ftr xmlns:o="urn:schemas-microsoft-com:office:office" xmlns:r="http://schemas.openxmlformats.org/officeDocument/2006/relationships" xmlns:v="urn:schemas-microsoft-com:vml" xmlns:w="http://schemas.openxmlformats.org/wordprocessingml/2006/main" xmlns:w10="urn:schemas-microsoft-com:office:word" xmlns:wp="http://schemas.openxmlformats.org/drawingml/2006/wordprocessingDrawing" xmlns:wps="http://schemas.microsoft.com/office/word/2010/wordprocessingShape" xmlns:wpg="http://schemas.microsoft.com/office/word/2010/wordprocessingGroup" xmlns:mc="http://schemas.openxmlformats.org/markup-compatibility/2006" xmlns:wp14="http://schemas.microsoft.com/office/word/2010/wordprocessingDrawing" xmlns:w14="http://schemas.microsoft.com/office/word/2010/wordml" xmlns:w15="http://schemas.microsoft.com/office/word/2012/wordml" mc:Ignorable="w14 wp14 w15">
-  <w:p>
-    <w:pPr>
-      <w:pStyle w:val="HeaderFooter"/>
-      <w:rPr/>
-    </w:pPr>
-    <w:r>
-      <w:rPr/>
-    </w:r>
-  </w:p>
-</w:ftr>
+<w:ftr xmlns:o="urn:schemas-microsoft-com:office:office" xmlns:r="http://schemas.openxmlformats.org/officeDocument/2006/relationships" xmlns:v="urn:schemas-microsoft-com:vml" xmlns:w="http://schemas.openxmlformats.org/wordprocessingml/2006/main" xmlns:w10="urn:schemas-microsoft-com:office:word" xmlns:wp="http://schemas.openxmlformats.org/drawingml/2006/wordprocessingDrawing" xmlns:wps="http://schemas.microsoft.com/office/word/2010/wordprocessingShape" xmlns:wpg="http://schemas.microsoft.com/office/word/2010/wordprocessingGroup" xmlns:mc="http://schemas.openxmlformats.org/markup-compatibility/2006" xmlns:wp14="http://schemas.microsoft.com/office/word/2010/wordprocessingDrawing" xmlns:w14="http://schemas.microsoft.com/office/word/2010/wordml" xmlns:w15="http://schemas.microsoft.com/office/word/2012/wordml" mc:Ignorable="w14 wp14 w15"/>
 </file>
 
 <file path=word/header1.xml><?xml version="1.0" encoding="utf-8"?>

</xml_diff>

<commit_message>
Deploying to gh-pages from  @ 97a761352e7584b4415aac336c578afbe2c6fc0c 🚀
</commit_message>
<xml_diff>
--- a/images/Resume.docx
+++ b/images/Resume.docx
@@ -1,6 +1,6 @@
 
 <file path=word/document.xml><?xml version="1.0" encoding="utf-8"?>
-<w:document xmlns:o="urn:schemas-microsoft-com:office:office" xmlns:r="http://schemas.openxmlformats.org/officeDocument/2006/relationships" xmlns:v="urn:schemas-microsoft-com:vml" xmlns:w="http://schemas.openxmlformats.org/wordprocessingml/2006/main" xmlns:w10="urn:schemas-microsoft-com:office:word" xmlns:wp="http://schemas.openxmlformats.org/drawingml/2006/wordprocessingDrawing" xmlns:wps="http://schemas.microsoft.com/office/word/2010/wordprocessingShape" xmlns:wpg="http://schemas.microsoft.com/office/word/2010/wordprocessingGroup" xmlns:mc="http://schemas.openxmlformats.org/markup-compatibility/2006" xmlns:wp14="http://schemas.microsoft.com/office/word/2010/wordprocessingDrawing" xmlns:w14="http://schemas.microsoft.com/office/word/2010/wordml" xmlns:w15="http://schemas.microsoft.com/office/word/2012/wordml" mc:Ignorable="w14 wp14 w15">
+<w:document xmlns:o="urn:schemas-microsoft-com:office:office" xmlns:r="http://schemas.openxmlformats.org/officeDocument/2006/relationships" xmlns:v="urn:schemas-microsoft-com:vml" xmlns:w="http://schemas.openxmlformats.org/wordprocessingml/2006/main" xmlns:w10="urn:schemas-microsoft-com:office:word" xmlns:wp="http://schemas.openxmlformats.org/drawingml/2006/wordprocessingDrawing" xmlns:pic="http://schemas.openxmlformats.org/drawingml/2006/picture" xmlns:wps="http://schemas.microsoft.com/office/word/2010/wordprocessingShape" xmlns:wpg="http://schemas.microsoft.com/office/word/2010/wordprocessingGroup" xmlns:mc="http://schemas.openxmlformats.org/markup-compatibility/2006" xmlns:wp14="http://schemas.microsoft.com/office/word/2010/wordprocessingDrawing" xmlns:w14="http://schemas.microsoft.com/office/word/2010/wordml" xmlns:w15="http://schemas.microsoft.com/office/word/2012/wordml" mc:Ignorable="w14 wp14 w15">
   <w:body>
     <w:p>
       <w:pPr>
@@ -676,11 +676,6 @@
           <w:bCs/>
           <w:color w:val="000000"/>
           <w:lang w:val="en-US"/>
-          <w14:textFill>
-            <w14:solidFill>
-              <w14:srgbClr w14:val="000000"/>
-            </w14:solidFill>
-          </w14:textFill>
         </w:rPr>
         <w:t>01/2019 to 05/2019</w:t>
       </w:r>
@@ -1442,11 +1437,6 @@
           <w:bCs/>
           <w:color w:val="FF0000"/>
           <w:lang w:val="en-US"/>
-          <w14:textFill>
-            <w14:solidFill>
-              <w14:srgbClr w14:val="FF0000"/>
-            </w14:solidFill>
-          </w14:textFill>
         </w:rPr>
         <w:t xml:space="preserve"> </w:t>
       </w:r>
@@ -1531,7 +1521,8 @@
       <w:headerReference w:type="default" r:id="rId4"/>
       <w:headerReference w:type="first" r:id="rId5"/>
       <w:footerReference w:type="even" r:id="rId6"/>
-      <w:footerReference w:type="first" r:id="rId7"/>
+      <w:footerReference w:type="default" r:id="rId7"/>
+      <w:footerReference w:type="first" r:id="rId8"/>
       <w:type w:val="nextPage"/>
       <w:pgSz w:w="12240" w:h="15840"/>
       <w:pgMar w:left="1440" w:right="1440" w:gutter="0" w:header="720" w:top="1152" w:footer="0" w:bottom="720"/>
@@ -1545,7 +1536,7 @@
 </file>
 
 <file path=word/footer1.xml><?xml version="1.0" encoding="utf-8"?>
-<w:ftr xmlns:o="urn:schemas-microsoft-com:office:office" xmlns:r="http://schemas.openxmlformats.org/officeDocument/2006/relationships" xmlns:v="urn:schemas-microsoft-com:vml" xmlns:w="http://schemas.openxmlformats.org/wordprocessingml/2006/main" xmlns:w10="urn:schemas-microsoft-com:office:word" xmlns:wp="http://schemas.openxmlformats.org/drawingml/2006/wordprocessingDrawing" xmlns:wps="http://schemas.microsoft.com/office/word/2010/wordprocessingShape" xmlns:wpg="http://schemas.microsoft.com/office/word/2010/wordprocessingGroup" xmlns:mc="http://schemas.openxmlformats.org/markup-compatibility/2006" xmlns:wp14="http://schemas.microsoft.com/office/word/2010/wordprocessingDrawing" xmlns:w14="http://schemas.microsoft.com/office/word/2010/wordml" xmlns:w15="http://schemas.microsoft.com/office/word/2012/wordml" mc:Ignorable="w14 wp14 w15">
+<w:ftr xmlns:o="urn:schemas-microsoft-com:office:office" xmlns:r="http://schemas.openxmlformats.org/officeDocument/2006/relationships" xmlns:v="urn:schemas-microsoft-com:vml" xmlns:w="http://schemas.openxmlformats.org/wordprocessingml/2006/main" xmlns:w10="urn:schemas-microsoft-com:office:word" xmlns:wp="http://schemas.openxmlformats.org/drawingml/2006/wordprocessingDrawing" xmlns:pic="http://schemas.openxmlformats.org/drawingml/2006/picture" xmlns:wps="http://schemas.microsoft.com/office/word/2010/wordprocessingShape" xmlns:wpg="http://schemas.microsoft.com/office/word/2010/wordprocessingGroup" xmlns:mc="http://schemas.openxmlformats.org/markup-compatibility/2006" xmlns:wp14="http://schemas.microsoft.com/office/word/2010/wordprocessingDrawing" xmlns:w14="http://schemas.microsoft.com/office/word/2010/wordml" xmlns:w15="http://schemas.microsoft.com/office/word/2012/wordml" mc:Ignorable="w14 wp14 w15">
   <w:p>
     <w:pPr>
       <w:pStyle w:val="Footer"/>
@@ -1559,11 +1550,35 @@
 </file>
 
 <file path=word/footer2.xml><?xml version="1.0" encoding="utf-8"?>
-<w:ftr xmlns:o="urn:schemas-microsoft-com:office:office" xmlns:r="http://schemas.openxmlformats.org/officeDocument/2006/relationships" xmlns:v="urn:schemas-microsoft-com:vml" xmlns:w="http://schemas.openxmlformats.org/wordprocessingml/2006/main" xmlns:w10="urn:schemas-microsoft-com:office:word" xmlns:wp="http://schemas.openxmlformats.org/drawingml/2006/wordprocessingDrawing" xmlns:wps="http://schemas.microsoft.com/office/word/2010/wordprocessingShape" xmlns:wpg="http://schemas.microsoft.com/office/word/2010/wordprocessingGroup" xmlns:mc="http://schemas.openxmlformats.org/markup-compatibility/2006" xmlns:wp14="http://schemas.microsoft.com/office/word/2010/wordprocessingDrawing" xmlns:w14="http://schemas.microsoft.com/office/word/2010/wordml" xmlns:w15="http://schemas.microsoft.com/office/word/2012/wordml" mc:Ignorable="w14 wp14 w15"/>
+<w:ftr xmlns:o="urn:schemas-microsoft-com:office:office" xmlns:r="http://schemas.openxmlformats.org/officeDocument/2006/relationships" xmlns:v="urn:schemas-microsoft-com:vml" xmlns:w="http://schemas.openxmlformats.org/wordprocessingml/2006/main" xmlns:w10="urn:schemas-microsoft-com:office:word" xmlns:wp="http://schemas.openxmlformats.org/drawingml/2006/wordprocessingDrawing" xmlns:pic="http://schemas.openxmlformats.org/drawingml/2006/picture" xmlns:wps="http://schemas.microsoft.com/office/word/2010/wordprocessingShape" xmlns:wpg="http://schemas.microsoft.com/office/word/2010/wordprocessingGroup" xmlns:mc="http://schemas.openxmlformats.org/markup-compatibility/2006" xmlns:wp14="http://schemas.microsoft.com/office/word/2010/wordprocessingDrawing" xmlns:w14="http://schemas.microsoft.com/office/word/2010/wordml" xmlns:w15="http://schemas.microsoft.com/office/word/2012/wordml" mc:Ignorable="w14 wp14 w15">
+  <w:p>
+    <w:pPr>
+      <w:pStyle w:val="Footer"/>
+      <w:rPr/>
+    </w:pPr>
+    <w:r>
+      <w:rPr/>
+    </w:r>
+  </w:p>
+</w:ftr>
+</file>
+
+<file path=word/footer3.xml><?xml version="1.0" encoding="utf-8"?>
+<w:ftr xmlns:o="urn:schemas-microsoft-com:office:office" xmlns:r="http://schemas.openxmlformats.org/officeDocument/2006/relationships" xmlns:v="urn:schemas-microsoft-com:vml" xmlns:w="http://schemas.openxmlformats.org/wordprocessingml/2006/main" xmlns:w10="urn:schemas-microsoft-com:office:word" xmlns:wp="http://schemas.openxmlformats.org/drawingml/2006/wordprocessingDrawing" xmlns:pic="http://schemas.openxmlformats.org/drawingml/2006/picture" xmlns:wps="http://schemas.microsoft.com/office/word/2010/wordprocessingShape" xmlns:wpg="http://schemas.microsoft.com/office/word/2010/wordprocessingGroup" xmlns:mc="http://schemas.openxmlformats.org/markup-compatibility/2006" xmlns:wp14="http://schemas.microsoft.com/office/word/2010/wordprocessingDrawing" xmlns:w14="http://schemas.microsoft.com/office/word/2010/wordml" xmlns:w15="http://schemas.microsoft.com/office/word/2012/wordml" mc:Ignorable="w14 wp14 w15">
+  <w:p>
+    <w:pPr>
+      <w:pStyle w:val="Footer"/>
+      <w:rPr/>
+    </w:pPr>
+    <w:r>
+      <w:rPr/>
+    </w:r>
+  </w:p>
+</w:ftr>
 </file>
 
 <file path=word/header1.xml><?xml version="1.0" encoding="utf-8"?>
-<w:hdr xmlns:o="urn:schemas-microsoft-com:office:office" xmlns:r="http://schemas.openxmlformats.org/officeDocument/2006/relationships" xmlns:v="urn:schemas-microsoft-com:vml" xmlns:w="http://schemas.openxmlformats.org/wordprocessingml/2006/main" xmlns:w10="urn:schemas-microsoft-com:office:word" xmlns:wp="http://schemas.openxmlformats.org/drawingml/2006/wordprocessingDrawing" xmlns:wps="http://schemas.microsoft.com/office/word/2010/wordprocessingShape" xmlns:wpg="http://schemas.microsoft.com/office/word/2010/wordprocessingGroup" xmlns:mc="http://schemas.openxmlformats.org/markup-compatibility/2006" xmlns:wp14="http://schemas.microsoft.com/office/word/2010/wordprocessingDrawing" xmlns:w14="http://schemas.microsoft.com/office/word/2010/wordml" xmlns:w15="http://schemas.microsoft.com/office/word/2012/wordml" mc:Ignorable="w14 wp14 w15">
+<w:hdr xmlns:o="urn:schemas-microsoft-com:office:office" xmlns:r="http://schemas.openxmlformats.org/officeDocument/2006/relationships" xmlns:v="urn:schemas-microsoft-com:vml" xmlns:w="http://schemas.openxmlformats.org/wordprocessingml/2006/main" xmlns:w10="urn:schemas-microsoft-com:office:word" xmlns:wp="http://schemas.openxmlformats.org/drawingml/2006/wordprocessingDrawing" xmlns:pic="http://schemas.openxmlformats.org/drawingml/2006/picture" xmlns:wps="http://schemas.microsoft.com/office/word/2010/wordprocessingShape" xmlns:wpg="http://schemas.microsoft.com/office/word/2010/wordprocessingGroup" xmlns:mc="http://schemas.openxmlformats.org/markup-compatibility/2006" xmlns:wp14="http://schemas.microsoft.com/office/word/2010/wordprocessingDrawing" xmlns:w14="http://schemas.microsoft.com/office/word/2010/wordml" xmlns:w15="http://schemas.microsoft.com/office/word/2012/wordml" mc:Ignorable="w14 wp14 w15">
   <w:p>
     <w:pPr>
       <w:pStyle w:val="Header"/>
@@ -1577,7 +1592,7 @@
 </file>
 
 <file path=word/header2.xml><?xml version="1.0" encoding="utf-8"?>
-<w:hdr xmlns:o="urn:schemas-microsoft-com:office:office" xmlns:r="http://schemas.openxmlformats.org/officeDocument/2006/relationships" xmlns:v="urn:schemas-microsoft-com:vml" xmlns:w="http://schemas.openxmlformats.org/wordprocessingml/2006/main" xmlns:w10="urn:schemas-microsoft-com:office:word" xmlns:wp="http://schemas.openxmlformats.org/drawingml/2006/wordprocessingDrawing" xmlns:wps="http://schemas.microsoft.com/office/word/2010/wordprocessingShape" xmlns:wpg="http://schemas.microsoft.com/office/word/2010/wordprocessingGroup" xmlns:mc="http://schemas.openxmlformats.org/markup-compatibility/2006" xmlns:wp14="http://schemas.microsoft.com/office/word/2010/wordprocessingDrawing" xmlns:w14="http://schemas.microsoft.com/office/word/2010/wordml" xmlns:w15="http://schemas.microsoft.com/office/word/2012/wordml" mc:Ignorable="w14 wp14 w15">
+<w:hdr xmlns:o="urn:schemas-microsoft-com:office:office" xmlns:r="http://schemas.openxmlformats.org/officeDocument/2006/relationships" xmlns:v="urn:schemas-microsoft-com:vml" xmlns:w="http://schemas.openxmlformats.org/wordprocessingml/2006/main" xmlns:w10="urn:schemas-microsoft-com:office:word" xmlns:wp="http://schemas.openxmlformats.org/drawingml/2006/wordprocessingDrawing" xmlns:pic="http://schemas.openxmlformats.org/drawingml/2006/picture" xmlns:wps="http://schemas.microsoft.com/office/word/2010/wordprocessingShape" xmlns:wpg="http://schemas.microsoft.com/office/word/2010/wordprocessingGroup" xmlns:mc="http://schemas.openxmlformats.org/markup-compatibility/2006" xmlns:wp14="http://schemas.microsoft.com/office/word/2010/wordprocessingDrawing" xmlns:w14="http://schemas.microsoft.com/office/word/2010/wordml" xmlns:w15="http://schemas.microsoft.com/office/word/2012/wordml" mc:Ignorable="w14 wp14 w15">
   <w:p>
     <w:pPr>
       <w:pStyle w:val="BodyA"/>
@@ -1607,11 +1622,7 @@
       </w:rPr>
     </w:pPr>
     <w:r>
-      <w:rPr>
-        <w:rFonts w:ascii="Arial" w:hAnsi="Arial"/>
-        <w:lang w:val="en-US"/>
-      </w:rPr>
-      <w:t>40 S Slator Ave</w:t>
+      <w:rPr/>
     </w:r>
   </w:p>
   <w:p>
@@ -1678,18 +1689,14 @@
       </w:rPr>
     </w:pPr>
     <w:r>
-      <w:rPr>
-        <w:rFonts w:ascii="Arial" w:hAnsi="Arial"/>
-        <w:lang w:val="en-US"/>
-      </w:rPr>
-      <w:t>(352) 464-1928</w:t>
+      <w:rPr/>
     </w:r>
   </w:p>
 </w:hdr>
 </file>
 
 <file path=word/header3.xml><?xml version="1.0" encoding="utf-8"?>
-<w:hdr xmlns:o="urn:schemas-microsoft-com:office:office" xmlns:r="http://schemas.openxmlformats.org/officeDocument/2006/relationships" xmlns:v="urn:schemas-microsoft-com:vml" xmlns:w="http://schemas.openxmlformats.org/wordprocessingml/2006/main" xmlns:w10="urn:schemas-microsoft-com:office:word" xmlns:wp="http://schemas.openxmlformats.org/drawingml/2006/wordprocessingDrawing" xmlns:wps="http://schemas.microsoft.com/office/word/2010/wordprocessingShape" xmlns:wpg="http://schemas.microsoft.com/office/word/2010/wordprocessingGroup" xmlns:mc="http://schemas.openxmlformats.org/markup-compatibility/2006" xmlns:wp14="http://schemas.microsoft.com/office/word/2010/wordprocessingDrawing" xmlns:w14="http://schemas.microsoft.com/office/word/2010/wordml" xmlns:w15="http://schemas.microsoft.com/office/word/2012/wordml" mc:Ignorable="w14 wp14 w15">
+<w:hdr xmlns:o="urn:schemas-microsoft-com:office:office" xmlns:r="http://schemas.openxmlformats.org/officeDocument/2006/relationships" xmlns:v="urn:schemas-microsoft-com:vml" xmlns:w="http://schemas.openxmlformats.org/wordprocessingml/2006/main" xmlns:w10="urn:schemas-microsoft-com:office:word" xmlns:wp="http://schemas.openxmlformats.org/drawingml/2006/wordprocessingDrawing" xmlns:pic="http://schemas.openxmlformats.org/drawingml/2006/picture" xmlns:wps="http://schemas.microsoft.com/office/word/2010/wordprocessingShape" xmlns:wpg="http://schemas.microsoft.com/office/word/2010/wordprocessingGroup" xmlns:mc="http://schemas.openxmlformats.org/markup-compatibility/2006" xmlns:wp14="http://schemas.microsoft.com/office/word/2010/wordprocessingDrawing" xmlns:w14="http://schemas.microsoft.com/office/word/2010/wordml" xmlns:w15="http://schemas.microsoft.com/office/word/2012/wordml" mc:Ignorable="w14 wp14 w15">
   <w:p>
     <w:pPr>
       <w:pStyle w:val="BodyA"/>
@@ -1719,11 +1726,7 @@
       </w:rPr>
     </w:pPr>
     <w:r>
-      <w:rPr>
-        <w:rFonts w:ascii="Arial" w:hAnsi="Arial"/>
-        <w:lang w:val="en-US"/>
-      </w:rPr>
-      <w:t>40 S Slator Ave</w:t>
+      <w:rPr/>
     </w:r>
   </w:p>
   <w:p>
@@ -1790,11 +1793,7 @@
       </w:rPr>
     </w:pPr>
     <w:r>
-      <w:rPr>
-        <w:rFonts w:ascii="Arial" w:hAnsi="Arial"/>
-        <w:lang w:val="en-US"/>
-      </w:rPr>
-      <w:t>(352) 464-1928</w:t>
+      <w:rPr/>
     </w:r>
   </w:p>
 </w:hdr>
@@ -1805,8 +1804,8 @@
   <w:abstractNum w:abstractNumId="1">
     <w:lvl w:ilvl="0">
       <w:start w:val="1"/>
-      <w:isLgl/>
-      <w:numFmt w:val="bullet"/>
+      <w:numFmt w:val="bullet"/>
+      <w:isLgl/>
       <w:lvlText w:val=""/>
       <w:lvlJc w:val="left"/>
       <w:pPr>
@@ -1821,8 +1820,8 @@
     </w:lvl>
     <w:lvl w:ilvl="1">
       <w:start w:val="1"/>
-      <w:isLgl/>
-      <w:numFmt w:val="bullet"/>
+      <w:numFmt w:val="bullet"/>
+      <w:isLgl/>
       <w:lvlText w:val="o"/>
       <w:lvlJc w:val="left"/>
       <w:pPr>
@@ -1833,230 +1832,222 @@
       </w:pPr>
       <w:rPr>
         <w:rFonts w:ascii="Arial Unicode MS" w:hAnsi="Arial Unicode MS" w:cs="Arial Unicode MS" w:hint="default"/>
+        <w:b w:val="false"/>
+        <w:bCs w:val="false"/>
+        <w:i w:val="false"/>
+        <w:iCs w:val="false"/>
+        <w:caps w:val="false"/>
         <w:smallCaps w:val="false"/>
-        <w:caps w:val="false"/>
+        <w:strike w:val="false"/>
         <w:dstrike w:val="false"/>
-        <w:strike w:val="false"/>
-        <w:vertAlign w:val="baseline"/>
+        <w:spacing w:val="0"/>
         <w:position w:val="0"/>
         <w:sz w:val="20"/>
-        <w:sz w:val="20"/>
+        <w:vertAlign w:val="baseline"/>
+      </w:rPr>
+    </w:lvl>
+    <w:lvl w:ilvl="2">
+      <w:start w:val="1"/>
+      <w:numFmt w:val="bullet"/>
+      <w:isLgl/>
+      <w:lvlText w:val="▪"/>
+      <w:lvlJc w:val="left"/>
+      <w:pPr>
+        <w:tabs>
+          <w:tab w:val="num" w:pos="0"/>
+        </w:tabs>
+        <w:ind w:left="2160" w:hanging="360"/>
+      </w:pPr>
+      <w:rPr>
+        <w:rFonts w:ascii="Arial Unicode MS" w:hAnsi="Arial Unicode MS" w:cs="Arial Unicode MS" w:hint="default"/>
+        <w:b w:val="false"/>
+        <w:bCs w:val="false"/>
+        <w:i w:val="false"/>
+        <w:iCs w:val="false"/>
+        <w:caps w:val="false"/>
+        <w:smallCaps w:val="false"/>
+        <w:strike w:val="false"/>
+        <w:dstrike w:val="false"/>
         <w:spacing w:val="0"/>
-        <w:i w:val="false"/>
-        <w:b w:val="false"/>
-        <w:iCs w:val="false"/>
-        <w:bCs w:val="false"/>
-      </w:rPr>
-    </w:lvl>
-    <w:lvl w:ilvl="2">
-      <w:start w:val="1"/>
-      <w:isLgl/>
-      <w:numFmt w:val="bullet"/>
-      <w:lvlText w:val="▪"/>
-      <w:lvlJc w:val="left"/>
-      <w:pPr>
-        <w:tabs>
-          <w:tab w:val="num" w:pos="0"/>
-        </w:tabs>
-        <w:ind w:left="2160" w:hanging="360"/>
-      </w:pPr>
-      <w:rPr>
-        <w:rFonts w:ascii="Arial Unicode MS" w:hAnsi="Arial Unicode MS" w:cs="Arial Unicode MS" w:hint="default"/>
-        <w:smallCaps w:val="false"/>
-        <w:caps w:val="false"/>
-        <w:dstrike w:val="false"/>
-        <w:strike w:val="false"/>
-        <w:vertAlign w:val="baseline"/>
         <w:position w:val="0"/>
         <w:sz w:val="20"/>
-        <w:sz w:val="20"/>
+        <w:vertAlign w:val="baseline"/>
+      </w:rPr>
+    </w:lvl>
+    <w:lvl w:ilvl="3">
+      <w:start w:val="1"/>
+      <w:numFmt w:val="bullet"/>
+      <w:isLgl/>
+      <w:lvlText w:val="·"/>
+      <w:lvlJc w:val="left"/>
+      <w:pPr>
+        <w:tabs>
+          <w:tab w:val="num" w:pos="0"/>
+        </w:tabs>
+        <w:ind w:left="2880" w:hanging="360"/>
+      </w:pPr>
+      <w:rPr>
+        <w:rFonts w:ascii="Symbol" w:hAnsi="Symbol" w:cs="Symbol" w:hint="default"/>
+        <w:b w:val="false"/>
+        <w:bCs w:val="false"/>
+        <w:i w:val="false"/>
+        <w:iCs w:val="false"/>
+        <w:caps w:val="false"/>
+        <w:smallCaps w:val="false"/>
+        <w:strike w:val="false"/>
+        <w:dstrike w:val="false"/>
         <w:spacing w:val="0"/>
-        <w:i w:val="false"/>
-        <w:b w:val="false"/>
-        <w:iCs w:val="false"/>
-        <w:bCs w:val="false"/>
-      </w:rPr>
-    </w:lvl>
-    <w:lvl w:ilvl="3">
-      <w:start w:val="1"/>
-      <w:isLgl/>
-      <w:numFmt w:val="bullet"/>
-      <w:lvlText w:val="·"/>
-      <w:lvlJc w:val="left"/>
-      <w:pPr>
-        <w:tabs>
-          <w:tab w:val="num" w:pos="0"/>
-        </w:tabs>
-        <w:ind w:left="2880" w:hanging="360"/>
-      </w:pPr>
-      <w:rPr>
-        <w:rFonts w:ascii="Symbol" w:hAnsi="Symbol" w:cs="Symbol" w:hint="default"/>
-        <w:smallCaps w:val="false"/>
-        <w:caps w:val="false"/>
-        <w:dstrike w:val="false"/>
-        <w:strike w:val="false"/>
-        <w:vertAlign w:val="baseline"/>
         <w:position w:val="0"/>
         <w:sz w:val="20"/>
-        <w:sz w:val="20"/>
+        <w:vertAlign w:val="baseline"/>
+      </w:rPr>
+    </w:lvl>
+    <w:lvl w:ilvl="4">
+      <w:start w:val="1"/>
+      <w:numFmt w:val="bullet"/>
+      <w:isLgl/>
+      <w:lvlText w:val="o"/>
+      <w:lvlJc w:val="left"/>
+      <w:pPr>
+        <w:tabs>
+          <w:tab w:val="num" w:pos="0"/>
+        </w:tabs>
+        <w:ind w:left="3600" w:hanging="360"/>
+      </w:pPr>
+      <w:rPr>
+        <w:rFonts w:ascii="Arial Unicode MS" w:hAnsi="Arial Unicode MS" w:cs="Arial Unicode MS" w:hint="default"/>
+        <w:b w:val="false"/>
+        <w:bCs w:val="false"/>
+        <w:i w:val="false"/>
+        <w:iCs w:val="false"/>
+        <w:caps w:val="false"/>
+        <w:smallCaps w:val="false"/>
+        <w:strike w:val="false"/>
+        <w:dstrike w:val="false"/>
         <w:spacing w:val="0"/>
-        <w:i w:val="false"/>
-        <w:b w:val="false"/>
-        <w:iCs w:val="false"/>
-        <w:bCs w:val="false"/>
-      </w:rPr>
-    </w:lvl>
-    <w:lvl w:ilvl="4">
-      <w:start w:val="1"/>
-      <w:isLgl/>
-      <w:numFmt w:val="bullet"/>
-      <w:lvlText w:val="o"/>
-      <w:lvlJc w:val="left"/>
-      <w:pPr>
-        <w:tabs>
-          <w:tab w:val="num" w:pos="0"/>
-        </w:tabs>
-        <w:ind w:left="3600" w:hanging="360"/>
-      </w:pPr>
-      <w:rPr>
-        <w:rFonts w:ascii="Arial Unicode MS" w:hAnsi="Arial Unicode MS" w:cs="Arial Unicode MS" w:hint="default"/>
-        <w:smallCaps w:val="false"/>
-        <w:caps w:val="false"/>
-        <w:dstrike w:val="false"/>
-        <w:strike w:val="false"/>
-        <w:vertAlign w:val="baseline"/>
         <w:position w:val="0"/>
         <w:sz w:val="20"/>
-        <w:sz w:val="20"/>
+        <w:vertAlign w:val="baseline"/>
+      </w:rPr>
+    </w:lvl>
+    <w:lvl w:ilvl="5">
+      <w:start w:val="1"/>
+      <w:numFmt w:val="bullet"/>
+      <w:isLgl/>
+      <w:lvlText w:val="▪"/>
+      <w:lvlJc w:val="left"/>
+      <w:pPr>
+        <w:tabs>
+          <w:tab w:val="num" w:pos="0"/>
+        </w:tabs>
+        <w:ind w:left="4320" w:hanging="360"/>
+      </w:pPr>
+      <w:rPr>
+        <w:rFonts w:ascii="Arial Unicode MS" w:hAnsi="Arial Unicode MS" w:cs="Arial Unicode MS" w:hint="default"/>
+        <w:b w:val="false"/>
+        <w:bCs w:val="false"/>
+        <w:i w:val="false"/>
+        <w:iCs w:val="false"/>
+        <w:caps w:val="false"/>
+        <w:smallCaps w:val="false"/>
+        <w:strike w:val="false"/>
+        <w:dstrike w:val="false"/>
         <w:spacing w:val="0"/>
-        <w:i w:val="false"/>
-        <w:b w:val="false"/>
-        <w:iCs w:val="false"/>
-        <w:bCs w:val="false"/>
-      </w:rPr>
-    </w:lvl>
-    <w:lvl w:ilvl="5">
-      <w:start w:val="1"/>
-      <w:isLgl/>
-      <w:numFmt w:val="bullet"/>
-      <w:lvlText w:val="▪"/>
-      <w:lvlJc w:val="left"/>
-      <w:pPr>
-        <w:tabs>
-          <w:tab w:val="num" w:pos="0"/>
-        </w:tabs>
-        <w:ind w:left="4320" w:hanging="360"/>
-      </w:pPr>
-      <w:rPr>
-        <w:rFonts w:ascii="Arial Unicode MS" w:hAnsi="Arial Unicode MS" w:cs="Arial Unicode MS" w:hint="default"/>
-        <w:smallCaps w:val="false"/>
-        <w:caps w:val="false"/>
-        <w:dstrike w:val="false"/>
-        <w:strike w:val="false"/>
-        <w:vertAlign w:val="baseline"/>
         <w:position w:val="0"/>
         <w:sz w:val="20"/>
-        <w:sz w:val="20"/>
+        <w:vertAlign w:val="baseline"/>
+      </w:rPr>
+    </w:lvl>
+    <w:lvl w:ilvl="6">
+      <w:start w:val="1"/>
+      <w:numFmt w:val="bullet"/>
+      <w:isLgl/>
+      <w:lvlText w:val="·"/>
+      <w:lvlJc w:val="left"/>
+      <w:pPr>
+        <w:tabs>
+          <w:tab w:val="num" w:pos="0"/>
+        </w:tabs>
+        <w:ind w:left="5040" w:hanging="360"/>
+      </w:pPr>
+      <w:rPr>
+        <w:rFonts w:ascii="Symbol" w:hAnsi="Symbol" w:cs="Symbol" w:hint="default"/>
+        <w:b w:val="false"/>
+        <w:bCs w:val="false"/>
+        <w:i w:val="false"/>
+        <w:iCs w:val="false"/>
+        <w:caps w:val="false"/>
+        <w:smallCaps w:val="false"/>
+        <w:strike w:val="false"/>
+        <w:dstrike w:val="false"/>
         <w:spacing w:val="0"/>
-        <w:i w:val="false"/>
-        <w:b w:val="false"/>
-        <w:iCs w:val="false"/>
-        <w:bCs w:val="false"/>
-      </w:rPr>
-    </w:lvl>
-    <w:lvl w:ilvl="6">
-      <w:start w:val="1"/>
-      <w:isLgl/>
-      <w:numFmt w:val="bullet"/>
-      <w:lvlText w:val="·"/>
-      <w:lvlJc w:val="left"/>
-      <w:pPr>
-        <w:tabs>
-          <w:tab w:val="num" w:pos="0"/>
-        </w:tabs>
-        <w:ind w:left="5040" w:hanging="360"/>
-      </w:pPr>
-      <w:rPr>
-        <w:rFonts w:ascii="Symbol" w:hAnsi="Symbol" w:cs="Symbol" w:hint="default"/>
-        <w:smallCaps w:val="false"/>
-        <w:caps w:val="false"/>
-        <w:dstrike w:val="false"/>
-        <w:strike w:val="false"/>
-        <w:vertAlign w:val="baseline"/>
         <w:position w:val="0"/>
         <w:sz w:val="20"/>
-        <w:sz w:val="20"/>
+        <w:vertAlign w:val="baseline"/>
+      </w:rPr>
+    </w:lvl>
+    <w:lvl w:ilvl="7">
+      <w:start w:val="1"/>
+      <w:numFmt w:val="bullet"/>
+      <w:isLgl/>
+      <w:lvlText w:val="o"/>
+      <w:lvlJc w:val="left"/>
+      <w:pPr>
+        <w:tabs>
+          <w:tab w:val="num" w:pos="0"/>
+        </w:tabs>
+        <w:ind w:left="5760" w:hanging="360"/>
+      </w:pPr>
+      <w:rPr>
+        <w:rFonts w:ascii="Arial Unicode MS" w:hAnsi="Arial Unicode MS" w:cs="Arial Unicode MS" w:hint="default"/>
+        <w:b w:val="false"/>
+        <w:bCs w:val="false"/>
+        <w:i w:val="false"/>
+        <w:iCs w:val="false"/>
+        <w:caps w:val="false"/>
+        <w:smallCaps w:val="false"/>
+        <w:strike w:val="false"/>
+        <w:dstrike w:val="false"/>
         <w:spacing w:val="0"/>
-        <w:i w:val="false"/>
-        <w:b w:val="false"/>
-        <w:iCs w:val="false"/>
-        <w:bCs w:val="false"/>
-      </w:rPr>
-    </w:lvl>
-    <w:lvl w:ilvl="7">
-      <w:start w:val="1"/>
-      <w:isLgl/>
-      <w:numFmt w:val="bullet"/>
-      <w:lvlText w:val="o"/>
-      <w:lvlJc w:val="left"/>
-      <w:pPr>
-        <w:tabs>
-          <w:tab w:val="num" w:pos="0"/>
-        </w:tabs>
-        <w:ind w:left="5760" w:hanging="360"/>
-      </w:pPr>
-      <w:rPr>
-        <w:rFonts w:ascii="Arial Unicode MS" w:hAnsi="Arial Unicode MS" w:cs="Arial Unicode MS" w:hint="default"/>
-        <w:smallCaps w:val="false"/>
-        <w:caps w:val="false"/>
-        <w:dstrike w:val="false"/>
-        <w:strike w:val="false"/>
-        <w:vertAlign w:val="baseline"/>
         <w:position w:val="0"/>
         <w:sz w:val="20"/>
-        <w:sz w:val="20"/>
+        <w:vertAlign w:val="baseline"/>
+      </w:rPr>
+    </w:lvl>
+    <w:lvl w:ilvl="8">
+      <w:start w:val="1"/>
+      <w:numFmt w:val="bullet"/>
+      <w:isLgl/>
+      <w:lvlText w:val="▪"/>
+      <w:lvlJc w:val="left"/>
+      <w:pPr>
+        <w:tabs>
+          <w:tab w:val="num" w:pos="0"/>
+        </w:tabs>
+        <w:ind w:left="6480" w:hanging="360"/>
+      </w:pPr>
+      <w:rPr>
+        <w:rFonts w:ascii="Arial Unicode MS" w:hAnsi="Arial Unicode MS" w:cs="Arial Unicode MS" w:hint="default"/>
+        <w:b w:val="false"/>
+        <w:bCs w:val="false"/>
+        <w:i w:val="false"/>
+        <w:iCs w:val="false"/>
+        <w:caps w:val="false"/>
+        <w:smallCaps w:val="false"/>
+        <w:strike w:val="false"/>
+        <w:dstrike w:val="false"/>
         <w:spacing w:val="0"/>
-        <w:i w:val="false"/>
-        <w:b w:val="false"/>
-        <w:iCs w:val="false"/>
-        <w:bCs w:val="false"/>
-      </w:rPr>
-    </w:lvl>
-    <w:lvl w:ilvl="8">
-      <w:start w:val="1"/>
-      <w:isLgl/>
-      <w:numFmt w:val="bullet"/>
-      <w:lvlText w:val="▪"/>
-      <w:lvlJc w:val="left"/>
-      <w:pPr>
-        <w:tabs>
-          <w:tab w:val="num" w:pos="0"/>
-        </w:tabs>
-        <w:ind w:left="6480" w:hanging="360"/>
-      </w:pPr>
-      <w:rPr>
-        <w:rFonts w:ascii="Arial Unicode MS" w:hAnsi="Arial Unicode MS" w:cs="Arial Unicode MS" w:hint="default"/>
-        <w:smallCaps w:val="false"/>
-        <w:caps w:val="false"/>
-        <w:dstrike w:val="false"/>
-        <w:strike w:val="false"/>
-        <w:vertAlign w:val="baseline"/>
         <w:position w:val="0"/>
         <w:sz w:val="20"/>
-        <w:sz w:val="20"/>
-        <w:spacing w:val="0"/>
-        <w:i w:val="false"/>
-        <w:b w:val="false"/>
-        <w:iCs w:val="false"/>
-        <w:bCs w:val="false"/>
+        <w:vertAlign w:val="baseline"/>
       </w:rPr>
     </w:lvl>
   </w:abstractNum>
   <w:abstractNum w:abstractNumId="2">
     <w:lvl w:ilvl="0">
       <w:start w:val="1"/>
-      <w:isLgl/>
-      <w:numFmt w:val="bullet"/>
+      <w:numFmt w:val="bullet"/>
+      <w:isLgl/>
       <w:lvlText w:val=""/>
       <w:lvlJc w:val="left"/>
       <w:pPr>
@@ -2071,8 +2062,8 @@
     </w:lvl>
     <w:lvl w:ilvl="1">
       <w:start w:val="1"/>
-      <w:isLgl/>
-      <w:numFmt w:val="bullet"/>
+      <w:numFmt w:val="bullet"/>
+      <w:isLgl/>
       <w:lvlText w:val=""/>
       <w:lvlJc w:val="left"/>
       <w:pPr>
@@ -2087,8 +2078,8 @@
     </w:lvl>
     <w:lvl w:ilvl="2">
       <w:start w:val="1"/>
-      <w:isLgl/>
-      <w:numFmt w:val="bullet"/>
+      <w:numFmt w:val="bullet"/>
+      <w:isLgl/>
       <w:lvlText w:val=""/>
       <w:lvlJc w:val="left"/>
       <w:pPr>
@@ -2103,8 +2094,8 @@
     </w:lvl>
     <w:lvl w:ilvl="3">
       <w:start w:val="1"/>
-      <w:isLgl/>
-      <w:numFmt w:val="bullet"/>
+      <w:numFmt w:val="bullet"/>
+      <w:isLgl/>
       <w:lvlText w:val=""/>
       <w:lvlJc w:val="left"/>
       <w:pPr>
@@ -2119,8 +2110,8 @@
     </w:lvl>
     <w:lvl w:ilvl="4">
       <w:start w:val="1"/>
-      <w:isLgl/>
-      <w:numFmt w:val="bullet"/>
+      <w:numFmt w:val="bullet"/>
+      <w:isLgl/>
       <w:lvlText w:val=""/>
       <w:lvlJc w:val="left"/>
       <w:pPr>
@@ -2135,8 +2126,8 @@
     </w:lvl>
     <w:lvl w:ilvl="5">
       <w:start w:val="1"/>
-      <w:isLgl/>
-      <w:numFmt w:val="bullet"/>
+      <w:numFmt w:val="bullet"/>
+      <w:isLgl/>
       <w:lvlText w:val=""/>
       <w:lvlJc w:val="left"/>
       <w:pPr>
@@ -2151,8 +2142,8 @@
     </w:lvl>
     <w:lvl w:ilvl="6">
       <w:start w:val="1"/>
-      <w:isLgl/>
-      <w:numFmt w:val="bullet"/>
+      <w:numFmt w:val="bullet"/>
+      <w:isLgl/>
       <w:lvlText w:val=""/>
       <w:lvlJc w:val="left"/>
       <w:pPr>
@@ -2167,8 +2158,8 @@
     </w:lvl>
     <w:lvl w:ilvl="7">
       <w:start w:val="1"/>
-      <w:isLgl/>
-      <w:numFmt w:val="bullet"/>
+      <w:numFmt w:val="bullet"/>
+      <w:isLgl/>
       <w:lvlText w:val=""/>
       <w:lvlJc w:val="left"/>
       <w:pPr>
@@ -2183,8 +2174,8 @@
     </w:lvl>
     <w:lvl w:ilvl="8">
       <w:start w:val="1"/>
-      <w:isLgl/>
-      <w:numFmt w:val="bullet"/>
+      <w:numFmt w:val="bullet"/>
+      <w:isLgl/>
       <w:lvlText w:val=""/>
       <w:lvlJc w:val="left"/>
       <w:pPr>
@@ -2201,8 +2192,8 @@
   <w:abstractNum w:abstractNumId="3">
     <w:lvl w:ilvl="0">
       <w:start w:val="1"/>
-      <w:isLgl/>
-      <w:numFmt w:val="bullet"/>
+      <w:numFmt w:val="bullet"/>
+      <w:isLgl/>
       <w:lvlText w:val=""/>
       <w:lvlJc w:val="left"/>
       <w:pPr>
@@ -2217,8 +2208,8 @@
     </w:lvl>
     <w:lvl w:ilvl="1">
       <w:start w:val="1"/>
-      <w:isLgl/>
-      <w:numFmt w:val="bullet"/>
+      <w:numFmt w:val="bullet"/>
+      <w:isLgl/>
       <w:lvlText w:val="o"/>
       <w:lvlJc w:val="left"/>
       <w:pPr>
@@ -2233,8 +2224,8 @@
     </w:lvl>
     <w:lvl w:ilvl="2">
       <w:start w:val="1"/>
-      <w:isLgl/>
-      <w:numFmt w:val="bullet"/>
+      <w:numFmt w:val="bullet"/>
+      <w:isLgl/>
       <w:lvlText w:val="§"/>
       <w:lvlJc w:val="left"/>
       <w:pPr>
@@ -2249,8 +2240,8 @@
     </w:lvl>
     <w:lvl w:ilvl="3">
       <w:start w:val="1"/>
-      <w:isLgl/>
-      <w:numFmt w:val="bullet"/>
+      <w:numFmt w:val="bullet"/>
+      <w:isLgl/>
       <w:lvlText w:val="·"/>
       <w:lvlJc w:val="left"/>
       <w:pPr>
@@ -2265,8 +2256,8 @@
     </w:lvl>
     <w:lvl w:ilvl="4">
       <w:start w:val="1"/>
-      <w:isLgl/>
-      <w:numFmt w:val="bullet"/>
+      <w:numFmt w:val="bullet"/>
+      <w:isLgl/>
       <w:lvlText w:val="o"/>
       <w:lvlJc w:val="left"/>
       <w:pPr>
@@ -2281,8 +2272,8 @@
     </w:lvl>
     <w:lvl w:ilvl="5">
       <w:start w:val="1"/>
-      <w:isLgl/>
-      <w:numFmt w:val="bullet"/>
+      <w:numFmt w:val="bullet"/>
+      <w:isLgl/>
       <w:lvlText w:val="§"/>
       <w:lvlJc w:val="left"/>
       <w:pPr>
@@ -2297,8 +2288,8 @@
     </w:lvl>
     <w:lvl w:ilvl="6">
       <w:start w:val="1"/>
-      <w:isLgl/>
-      <w:numFmt w:val="bullet"/>
+      <w:numFmt w:val="bullet"/>
+      <w:isLgl/>
       <w:lvlText w:val="·"/>
       <w:lvlJc w:val="left"/>
       <w:pPr>
@@ -2313,8 +2304,8 @@
     </w:lvl>
     <w:lvl w:ilvl="7">
       <w:start w:val="1"/>
-      <w:isLgl/>
-      <w:numFmt w:val="bullet"/>
+      <w:numFmt w:val="bullet"/>
+      <w:isLgl/>
       <w:lvlText w:val="o"/>
       <w:lvlJc w:val="left"/>
       <w:pPr>
@@ -2329,8 +2320,8 @@
     </w:lvl>
     <w:lvl w:ilvl="8">
       <w:start w:val="1"/>
-      <w:isLgl/>
-      <w:numFmt w:val="bullet"/>
+      <w:numFmt w:val="bullet"/>
+      <w:isLgl/>
       <w:lvlText w:val="§"/>
       <w:lvlJc w:val="left"/>
       <w:pPr>
@@ -2347,8 +2338,8 @@
   <w:abstractNum w:abstractNumId="4">
     <w:lvl w:ilvl="0">
       <w:start w:val="1"/>
-      <w:isLgl/>
-      <w:numFmt w:val="bullet"/>
+      <w:numFmt w:val="bullet"/>
+      <w:isLgl/>
       <w:lvlText w:val=""/>
       <w:lvlJc w:val="left"/>
       <w:pPr>
@@ -2363,8 +2354,8 @@
     </w:lvl>
     <w:lvl w:ilvl="1">
       <w:start w:val="1"/>
-      <w:isLgl/>
-      <w:numFmt w:val="bullet"/>
+      <w:numFmt w:val="bullet"/>
+      <w:isLgl/>
       <w:lvlText w:val="o"/>
       <w:lvlJc w:val="left"/>
       <w:pPr>
@@ -2379,8 +2370,8 @@
     </w:lvl>
     <w:lvl w:ilvl="2">
       <w:start w:val="1"/>
-      <w:isLgl/>
-      <w:numFmt w:val="bullet"/>
+      <w:numFmt w:val="bullet"/>
+      <w:isLgl/>
       <w:lvlText w:val="§"/>
       <w:lvlJc w:val="left"/>
       <w:pPr>
@@ -2395,8 +2386,8 @@
     </w:lvl>
     <w:lvl w:ilvl="3">
       <w:start w:val="1"/>
-      <w:isLgl/>
-      <w:numFmt w:val="bullet"/>
+      <w:numFmt w:val="bullet"/>
+      <w:isLgl/>
       <w:lvlText w:val="·"/>
       <w:lvlJc w:val="left"/>
       <w:pPr>
@@ -2411,8 +2402,8 @@
     </w:lvl>
     <w:lvl w:ilvl="4">
       <w:start w:val="1"/>
-      <w:isLgl/>
-      <w:numFmt w:val="bullet"/>
+      <w:numFmt w:val="bullet"/>
+      <w:isLgl/>
       <w:lvlText w:val="o"/>
       <w:lvlJc w:val="left"/>
       <w:pPr>
@@ -2427,8 +2418,8 @@
     </w:lvl>
     <w:lvl w:ilvl="5">
       <w:start w:val="1"/>
-      <w:isLgl/>
-      <w:numFmt w:val="bullet"/>
+      <w:numFmt w:val="bullet"/>
+      <w:isLgl/>
       <w:lvlText w:val="§"/>
       <w:lvlJc w:val="left"/>
       <w:pPr>
@@ -2443,8 +2434,8 @@
     </w:lvl>
     <w:lvl w:ilvl="6">
       <w:start w:val="1"/>
-      <w:isLgl/>
-      <w:numFmt w:val="bullet"/>
+      <w:numFmt w:val="bullet"/>
+      <w:isLgl/>
       <w:lvlText w:val="·"/>
       <w:lvlJc w:val="left"/>
       <w:pPr>
@@ -2459,8 +2450,8 @@
     </w:lvl>
     <w:lvl w:ilvl="7">
       <w:start w:val="1"/>
-      <w:isLgl/>
-      <w:numFmt w:val="bullet"/>
+      <w:numFmt w:val="bullet"/>
+      <w:isLgl/>
       <w:lvlText w:val="o"/>
       <w:lvlJc w:val="left"/>
       <w:pPr>
@@ -2475,8 +2466,8 @@
     </w:lvl>
     <w:lvl w:ilvl="8">
       <w:start w:val="1"/>
-      <w:isLgl/>
-      <w:numFmt w:val="bullet"/>
+      <w:numFmt w:val="bullet"/>
+      <w:isLgl/>
       <w:lvlText w:val="§"/>
       <w:lvlJc w:val="left"/>
       <w:pPr>
@@ -2493,8 +2484,8 @@
   <w:abstractNum w:abstractNumId="5">
     <w:lvl w:ilvl="0">
       <w:start w:val="1"/>
-      <w:isLgl/>
-      <w:numFmt w:val="bullet"/>
+      <w:numFmt w:val="bullet"/>
+      <w:isLgl/>
       <w:lvlText w:val=""/>
       <w:lvlJc w:val="left"/>
       <w:pPr>
@@ -2509,8 +2500,8 @@
     </w:lvl>
     <w:lvl w:ilvl="1">
       <w:start w:val="1"/>
-      <w:isLgl/>
-      <w:numFmt w:val="bullet"/>
+      <w:numFmt w:val="bullet"/>
+      <w:isLgl/>
       <w:lvlText w:val="o"/>
       <w:lvlJc w:val="left"/>
       <w:pPr>
@@ -2525,8 +2516,8 @@
     </w:lvl>
     <w:lvl w:ilvl="2">
       <w:start w:val="1"/>
-      <w:isLgl/>
-      <w:numFmt w:val="bullet"/>
+      <w:numFmt w:val="bullet"/>
+      <w:isLgl/>
       <w:lvlText w:val="§"/>
       <w:lvlJc w:val="left"/>
       <w:pPr>
@@ -2541,8 +2532,8 @@
     </w:lvl>
     <w:lvl w:ilvl="3">
       <w:start w:val="1"/>
-      <w:isLgl/>
-      <w:numFmt w:val="bullet"/>
+      <w:numFmt w:val="bullet"/>
+      <w:isLgl/>
       <w:lvlText w:val="·"/>
       <w:lvlJc w:val="left"/>
       <w:pPr>
@@ -2557,8 +2548,8 @@
     </w:lvl>
     <w:lvl w:ilvl="4">
       <w:start w:val="1"/>
-      <w:isLgl/>
-      <w:numFmt w:val="bullet"/>
+      <w:numFmt w:val="bullet"/>
+      <w:isLgl/>
       <w:lvlText w:val="o"/>
       <w:lvlJc w:val="left"/>
       <w:pPr>
@@ -2573,8 +2564,8 @@
     </w:lvl>
     <w:lvl w:ilvl="5">
       <w:start w:val="1"/>
-      <w:isLgl/>
-      <w:numFmt w:val="bullet"/>
+      <w:numFmt w:val="bullet"/>
+      <w:isLgl/>
       <w:lvlText w:val="§"/>
       <w:lvlJc w:val="left"/>
       <w:pPr>
@@ -2589,8 +2580,8 @@
     </w:lvl>
     <w:lvl w:ilvl="6">
       <w:start w:val="1"/>
-      <w:isLgl/>
-      <w:numFmt w:val="bullet"/>
+      <w:numFmt w:val="bullet"/>
+      <w:isLgl/>
       <w:lvlText w:val="·"/>
       <w:lvlJc w:val="left"/>
       <w:pPr>
@@ -2605,8 +2596,8 @@
     </w:lvl>
     <w:lvl w:ilvl="7">
       <w:start w:val="1"/>
-      <w:isLgl/>
-      <w:numFmt w:val="bullet"/>
+      <w:numFmt w:val="bullet"/>
+      <w:isLgl/>
       <w:lvlText w:val="o"/>
       <w:lvlJc w:val="left"/>
       <w:pPr>
@@ -2621,8 +2612,8 @@
     </w:lvl>
     <w:lvl w:ilvl="8">
       <w:start w:val="1"/>
-      <w:isLgl/>
-      <w:numFmt w:val="bullet"/>
+      <w:numFmt w:val="bullet"/>
+      <w:isLgl/>
       <w:lvlText w:val="§"/>
       <w:lvlJc w:val="left"/>
       <w:pPr>
@@ -2639,8 +2630,8 @@
   <w:abstractNum w:abstractNumId="6">
     <w:lvl w:ilvl="0">
       <w:start w:val="1"/>
-      <w:isLgl/>
-      <w:numFmt w:val="bullet"/>
+      <w:numFmt w:val="bullet"/>
+      <w:isLgl/>
       <w:lvlText w:val=""/>
       <w:lvlJc w:val="left"/>
       <w:pPr>
@@ -2655,8 +2646,8 @@
     </w:lvl>
     <w:lvl w:ilvl="1">
       <w:start w:val="1"/>
-      <w:isLgl/>
-      <w:numFmt w:val="bullet"/>
+      <w:numFmt w:val="bullet"/>
+      <w:isLgl/>
       <w:lvlText w:val="o"/>
       <w:lvlJc w:val="left"/>
       <w:pPr>
@@ -2671,8 +2662,8 @@
     </w:lvl>
     <w:lvl w:ilvl="2">
       <w:start w:val="1"/>
-      <w:isLgl/>
-      <w:numFmt w:val="bullet"/>
+      <w:numFmt w:val="bullet"/>
+      <w:isLgl/>
       <w:lvlText w:val="§"/>
       <w:lvlJc w:val="left"/>
       <w:pPr>
@@ -2687,8 +2678,8 @@
     </w:lvl>
     <w:lvl w:ilvl="3">
       <w:start w:val="1"/>
-      <w:isLgl/>
-      <w:numFmt w:val="bullet"/>
+      <w:numFmt w:val="bullet"/>
+      <w:isLgl/>
       <w:lvlText w:val="·"/>
       <w:lvlJc w:val="left"/>
       <w:pPr>
@@ -2703,8 +2694,8 @@
     </w:lvl>
     <w:lvl w:ilvl="4">
       <w:start w:val="1"/>
-      <w:isLgl/>
-      <w:numFmt w:val="bullet"/>
+      <w:numFmt w:val="bullet"/>
+      <w:isLgl/>
       <w:lvlText w:val="o"/>
       <w:lvlJc w:val="left"/>
       <w:pPr>
@@ -2719,8 +2710,8 @@
     </w:lvl>
     <w:lvl w:ilvl="5">
       <w:start w:val="1"/>
-      <w:isLgl/>
-      <w:numFmt w:val="bullet"/>
+      <w:numFmt w:val="bullet"/>
+      <w:isLgl/>
       <w:lvlText w:val="§"/>
       <w:lvlJc w:val="left"/>
       <w:pPr>
@@ -2735,8 +2726,8 @@
     </w:lvl>
     <w:lvl w:ilvl="6">
       <w:start w:val="1"/>
-      <w:isLgl/>
-      <w:numFmt w:val="bullet"/>
+      <w:numFmt w:val="bullet"/>
+      <w:isLgl/>
       <w:lvlText w:val="·"/>
       <w:lvlJc w:val="left"/>
       <w:pPr>
@@ -2751,8 +2742,8 @@
     </w:lvl>
     <w:lvl w:ilvl="7">
       <w:start w:val="1"/>
-      <w:isLgl/>
-      <w:numFmt w:val="bullet"/>
+      <w:numFmt w:val="bullet"/>
+      <w:isLgl/>
       <w:lvlText w:val="o"/>
       <w:lvlJc w:val="left"/>
       <w:pPr>
@@ -2767,8 +2758,8 @@
     </w:lvl>
     <w:lvl w:ilvl="8">
       <w:start w:val="1"/>
-      <w:isLgl/>
-      <w:numFmt w:val="bullet"/>
+      <w:numFmt w:val="bullet"/>
+      <w:isLgl/>
       <w:lvlText w:val="§"/>
       <w:lvlJc w:val="left"/>
       <w:pPr>
@@ -3520,7 +3511,7 @@
     </w:rPr>
   </w:style>
   <w:style w:type="paragraph" w:styleId="Heading1">
-    <w:name w:val="Heading 1"/>
+    <w:name w:val="heading 1"/>
     <w:basedOn w:val="Normal"/>
     <w:uiPriority w:val="9"/>
     <w:qFormat/>
@@ -3537,7 +3528,7 @@
     </w:rPr>
   </w:style>
   <w:style w:type="paragraph" w:styleId="Heading2">
-    <w:name w:val="Heading 2"/>
+    <w:name w:val="heading 2"/>
     <w:basedOn w:val="Normal"/>
     <w:uiPriority w:val="9"/>
     <w:unhideWhenUsed/>
@@ -3554,7 +3545,7 @@
     </w:rPr>
   </w:style>
   <w:style w:type="paragraph" w:styleId="Heading3">
-    <w:name w:val="Heading 3"/>
+    <w:name w:val="heading 3"/>
     <w:basedOn w:val="Normal"/>
     <w:uiPriority w:val="9"/>
     <w:unhideWhenUsed/>
@@ -3572,7 +3563,7 @@
     </w:rPr>
   </w:style>
   <w:style w:type="paragraph" w:styleId="Heading4">
-    <w:name w:val="Heading 4"/>
+    <w:name w:val="heading 4"/>
     <w:basedOn w:val="Normal"/>
     <w:uiPriority w:val="9"/>
     <w:unhideWhenUsed/>
@@ -3592,7 +3583,7 @@
     </w:rPr>
   </w:style>
   <w:style w:type="paragraph" w:styleId="Heading5">
-    <w:name w:val="Heading 5"/>
+    <w:name w:val="heading 5"/>
     <w:basedOn w:val="Normal"/>
     <w:uiPriority w:val="9"/>
     <w:unhideWhenUsed/>
@@ -3612,7 +3603,7 @@
     </w:rPr>
   </w:style>
   <w:style w:type="paragraph" w:styleId="Heading6">
-    <w:name w:val="Heading 6"/>
+    <w:name w:val="heading 6"/>
     <w:basedOn w:val="Normal"/>
     <w:uiPriority w:val="9"/>
     <w:unhideWhenUsed/>
@@ -3632,7 +3623,7 @@
     </w:rPr>
   </w:style>
   <w:style w:type="paragraph" w:styleId="Heading7">
-    <w:name w:val="Heading 7"/>
+    <w:name w:val="heading 7"/>
     <w:basedOn w:val="Normal"/>
     <w:uiPriority w:val="9"/>
     <w:unhideWhenUsed/>
@@ -3654,7 +3645,7 @@
     </w:rPr>
   </w:style>
   <w:style w:type="paragraph" w:styleId="Heading8">
-    <w:name w:val="Heading 8"/>
+    <w:name w:val="heading 8"/>
     <w:basedOn w:val="Normal"/>
     <w:uiPriority w:val="9"/>
     <w:unhideWhenUsed/>
@@ -3674,7 +3665,7 @@
     </w:rPr>
   </w:style>
   <w:style w:type="paragraph" w:styleId="Heading9">
-    <w:name w:val="Heading 9"/>
+    <w:name w:val="heading 9"/>
     <w:basedOn w:val="Normal"/>
     <w:uiPriority w:val="9"/>
     <w:unhideWhenUsed/>
@@ -3869,59 +3860,66 @@
       <w:sz w:val="18"/>
     </w:rPr>
   </w:style>
+  <w:style w:type="character" w:styleId="FootnoteCharactersuser">
+    <w:name w:val="Footnote Characters (user)"/>
+    <w:uiPriority w:val="99"/>
+    <w:unhideWhenUsed/>
+    <w:qFormat/>
+    <w:rPr>
+      <w:vertAlign w:val="superscript"/>
+    </w:rPr>
+  </w:style>
+  <w:style w:type="character" w:styleId="FootnoteCharacters1">
+    <w:name w:val="Footnote Characters1"/>
+    <w:qFormat/>
+    <w:rPr>
+      <w:vertAlign w:val="superscript"/>
+    </w:rPr>
+  </w:style>
+  <w:style w:type="character" w:styleId="FootnoteCharacters2">
+    <w:name w:val="Footnote Characters2"/>
+    <w:qFormat/>
+    <w:rPr>
+      <w:vertAlign w:val="superscript"/>
+    </w:rPr>
+  </w:style>
+  <w:style w:type="character" w:styleId="FootnoteCharacters3">
+    <w:name w:val="Footnote Characters3"/>
+    <w:qFormat/>
+    <w:rPr>
+      <w:vertAlign w:val="superscript"/>
+    </w:rPr>
+  </w:style>
+  <w:style w:type="character" w:styleId="FootnoteCharacters4">
+    <w:name w:val="Footnote Characters4"/>
+    <w:qFormat/>
+    <w:rPr>
+      <w:vertAlign w:val="superscript"/>
+    </w:rPr>
+  </w:style>
+  <w:style w:type="character" w:styleId="FootnoteCharacters5">
+    <w:name w:val="Footnote Characters5"/>
+    <w:qFormat/>
+    <w:rPr>
+      <w:vertAlign w:val="superscript"/>
+    </w:rPr>
+  </w:style>
+  <w:style w:type="character" w:styleId="FootnoteCharacters6">
+    <w:name w:val="Footnote Characters6"/>
+    <w:qFormat/>
+    <w:rPr>
+      <w:vertAlign w:val="superscript"/>
+    </w:rPr>
+  </w:style>
   <w:style w:type="character" w:styleId="FootnoteCharacters">
     <w:name w:val="Footnote Characters"/>
-    <w:uiPriority w:val="99"/>
-    <w:unhideWhenUsed/>
     <w:qFormat/>
     <w:rPr>
       <w:vertAlign w:val="superscript"/>
     </w:rPr>
   </w:style>
-  <w:style w:type="character" w:styleId="FootnoteCharacters1">
-    <w:name w:val="Footnote Characters1"/>
-    <w:qFormat/>
-    <w:rPr>
-      <w:vertAlign w:val="superscript"/>
-    </w:rPr>
-  </w:style>
-  <w:style w:type="character" w:styleId="FootnoteCharacters2">
-    <w:name w:val="Footnote Characters2"/>
-    <w:qFormat/>
-    <w:rPr>
-      <w:vertAlign w:val="superscript"/>
-    </w:rPr>
-  </w:style>
-  <w:style w:type="character" w:styleId="FootnoteCharacters3">
-    <w:name w:val="Footnote Characters3"/>
-    <w:qFormat/>
-    <w:rPr>
-      <w:vertAlign w:val="superscript"/>
-    </w:rPr>
-  </w:style>
-  <w:style w:type="character" w:styleId="FootnoteCharacters4">
-    <w:name w:val="Footnote Characters4"/>
-    <w:qFormat/>
-    <w:rPr>
-      <w:vertAlign w:val="superscript"/>
-    </w:rPr>
-  </w:style>
-  <w:style w:type="character" w:styleId="FootnoteCharacters5">
-    <w:name w:val="Footnote Characters5"/>
-    <w:qFormat/>
-    <w:rPr>
-      <w:vertAlign w:val="superscript"/>
-    </w:rPr>
-  </w:style>
-  <w:style w:type="character" w:styleId="FootnoteCharacters6">
-    <w:name w:val="Footnote Characters6"/>
-    <w:qFormat/>
-    <w:rPr>
-      <w:vertAlign w:val="superscript"/>
-    </w:rPr>
-  </w:style>
   <w:style w:type="character" w:styleId="FootnoteReference">
-    <w:name w:val="Footnote Reference"/>
+    <w:name w:val="footnote reference"/>
     <w:rPr>
       <w:vertAlign w:val="superscript"/>
     </w:rPr>
@@ -3934,8 +3932,8 @@
       <w:sz w:val="20"/>
     </w:rPr>
   </w:style>
-  <w:style w:type="character" w:styleId="EndnoteCharacters">
-    <w:name w:val="Endnote Characters"/>
+  <w:style w:type="character" w:styleId="EndnoteCharactersuser">
+    <w:name w:val="Endnote Characters (user)"/>
     <w:uiPriority w:val="99"/>
     <w:semiHidden/>
     <w:unhideWhenUsed/>
@@ -3986,8 +3984,15 @@
       <w:vertAlign w:val="superscript"/>
     </w:rPr>
   </w:style>
+  <w:style w:type="character" w:styleId="EndnoteCharacters">
+    <w:name w:val="Endnote Characters"/>
+    <w:qFormat/>
+    <w:rPr>
+      <w:vertAlign w:val="superscript"/>
+    </w:rPr>
+  </w:style>
   <w:style w:type="character" w:styleId="EndnoteReference">
-    <w:name w:val="Endnote Reference"/>
+    <w:name w:val="endnote reference"/>
     <w:rPr>
       <w:vertAlign w:val="superscript"/>
     </w:rPr>
@@ -4003,8 +4008,8 @@
       <w:u w:val="single"/>
     </w:rPr>
   </w:style>
-  <w:style w:type="character" w:styleId="Bullets">
-    <w:name w:val="Bullets"/>
+  <w:style w:type="character" w:styleId="Bulletsuser">
+    <w:name w:val="Bullets (user)"/>
     <w:qFormat/>
     <w:rPr>
       <w:rFonts w:ascii="OpenSymbol" w:hAnsi="OpenSymbol" w:eastAsia="OpenSymbol" w:cs="OpenSymbol"/>
@@ -4042,7 +4047,7 @@
     </w:rPr>
   </w:style>
   <w:style w:type="paragraph" w:styleId="Caption">
-    <w:name w:val="Caption"/>
+    <w:name w:val="caption"/>
     <w:basedOn w:val="Normal"/>
     <w:uiPriority w:val="35"/>
     <w:semiHidden/>
@@ -4158,7 +4163,7 @@
     <w:rPr/>
   </w:style>
   <w:style w:type="paragraph" w:styleId="Header">
-    <w:name w:val="Header"/>
+    <w:name w:val="header"/>
     <w:basedOn w:val="Normal"/>
     <w:uiPriority w:val="99"/>
     <w:unhideWhenUsed/>
@@ -4173,7 +4178,7 @@
     <w:rPr/>
   </w:style>
   <w:style w:type="paragraph" w:styleId="Footer">
-    <w:name w:val="Footer"/>
+    <w:name w:val="footer"/>
     <w:basedOn w:val="Normal"/>
     <w:uiPriority w:val="99"/>
     <w:unhideWhenUsed/>
@@ -4188,7 +4193,7 @@
     <w:rPr/>
   </w:style>
   <w:style w:type="paragraph" w:styleId="FootnoteText">
-    <w:name w:val="Footnote Text"/>
+    <w:name w:val="footnote text"/>
     <w:basedOn w:val="Normal"/>
     <w:uiPriority w:val="99"/>
     <w:semiHidden/>
@@ -4201,7 +4206,7 @@
     </w:rPr>
   </w:style>
   <w:style w:type="paragraph" w:styleId="EndnoteText">
-    <w:name w:val="Endnote Text"/>
+    <w:name w:val="endnote text"/>
     <w:basedOn w:val="Normal"/>
     <w:uiPriority w:val="99"/>
     <w:semiHidden/>
@@ -4214,7 +4219,7 @@
     </w:rPr>
   </w:style>
   <w:style w:type="paragraph" w:styleId="TOC1">
-    <w:name w:val="TOC 1"/>
+    <w:name w:val="toc 1"/>
     <w:basedOn w:val="Normal"/>
     <w:uiPriority w:val="39"/>
     <w:unhideWhenUsed/>
@@ -4225,7 +4230,7 @@
     <w:rPr/>
   </w:style>
   <w:style w:type="paragraph" w:styleId="TOC2">
-    <w:name w:val="TOC 2"/>
+    <w:name w:val="toc 2"/>
     <w:basedOn w:val="Normal"/>
     <w:uiPriority w:val="39"/>
     <w:unhideWhenUsed/>
@@ -4236,7 +4241,7 @@
     <w:rPr/>
   </w:style>
   <w:style w:type="paragraph" w:styleId="TOC3">
-    <w:name w:val="TOC 3"/>
+    <w:name w:val="toc 3"/>
     <w:basedOn w:val="Normal"/>
     <w:uiPriority w:val="39"/>
     <w:unhideWhenUsed/>
@@ -4247,7 +4252,7 @@
     <w:rPr/>
   </w:style>
   <w:style w:type="paragraph" w:styleId="TOC4">
-    <w:name w:val="TOC 4"/>
+    <w:name w:val="toc 4"/>
     <w:basedOn w:val="Normal"/>
     <w:uiPriority w:val="39"/>
     <w:unhideWhenUsed/>
@@ -4258,7 +4263,7 @@
     <w:rPr/>
   </w:style>
   <w:style w:type="paragraph" w:styleId="TOC5">
-    <w:name w:val="TOC 5"/>
+    <w:name w:val="toc 5"/>
     <w:basedOn w:val="Normal"/>
     <w:uiPriority w:val="39"/>
     <w:unhideWhenUsed/>
@@ -4269,7 +4274,7 @@
     <w:rPr/>
   </w:style>
   <w:style w:type="paragraph" w:styleId="TOC6">
-    <w:name w:val="TOC 6"/>
+    <w:name w:val="toc 6"/>
     <w:basedOn w:val="Normal"/>
     <w:uiPriority w:val="39"/>
     <w:unhideWhenUsed/>
@@ -4280,7 +4285,7 @@
     <w:rPr/>
   </w:style>
   <w:style w:type="paragraph" w:styleId="TOC7">
-    <w:name w:val="TOC 7"/>
+    <w:name w:val="toc 7"/>
     <w:basedOn w:val="Normal"/>
     <w:uiPriority w:val="39"/>
     <w:unhideWhenUsed/>
@@ -4291,7 +4296,7 @@
     <w:rPr/>
   </w:style>
   <w:style w:type="paragraph" w:styleId="TOC8">
-    <w:name w:val="TOC 8"/>
+    <w:name w:val="toc 8"/>
     <w:basedOn w:val="Normal"/>
     <w:uiPriority w:val="39"/>
     <w:unhideWhenUsed/>
@@ -4302,7 +4307,7 @@
     <w:rPr/>
   </w:style>
   <w:style w:type="paragraph" w:styleId="TOC9">
-    <w:name w:val="TOC 9"/>
+    <w:name w:val="toc 9"/>
     <w:basedOn w:val="Normal"/>
     <w:uiPriority w:val="39"/>
     <w:unhideWhenUsed/>
@@ -4313,7 +4318,7 @@
     <w:rPr/>
   </w:style>
   <w:style w:type="paragraph" w:styleId="IndexHeading">
-    <w:name w:val="Index Heading"/>
+    <w:name w:val="index heading"/>
     <w:basedOn w:val="Heading"/>
     <w:pPr/>
     <w:rPr/>
@@ -4341,7 +4346,7 @@
     </w:rPr>
   </w:style>
   <w:style w:type="paragraph" w:styleId="TableofFigures">
-    <w:name w:val="Table of Figures"/>
+    <w:name w:val="table of figures"/>
     <w:basedOn w:val="Normal"/>
     <w:uiPriority w:val="99"/>
     <w:unhideWhenUsed/>
@@ -4384,7 +4389,6 @@
       <w:kern w:val="0"/>
       <w:position w:val="0"/>
       <w:sz w:val="26"/>
-      <w:sz w:val="26"/>
       <w:szCs w:val="26"/>
       <w:u w:val="none"/>
       <w:shd w:fill="auto" w:val="clear"/>
@@ -4393,11 +4397,6 @@
       <w14:textOutline>
         <w14:noFill/>
       </w14:textOutline>
-      <w14:textFill>
-        <w14:solidFill>
-          <w14:srgbClr w14:val="000000"/>
-        </w14:solidFill>
-      </w14:textFill>
     </w:rPr>
   </w:style>
   <w:style w:type="paragraph" w:styleId="BodyA">
@@ -4430,7 +4429,6 @@
       <w:kern w:val="0"/>
       <w:position w:val="0"/>
       <w:sz w:val="24"/>
-      <w:sz w:val="24"/>
       <w:szCs w:val="24"/>
       <w:u w:val="none"/>
       <w:shd w:fill="auto" w:val="clear"/>
@@ -4440,11 +4438,6 @@
         <w14:noFill/>
         <w14:miter w14:lim="400000"/>
       </w14:textOutline>
-      <w14:textFill>
-        <w14:solidFill>
-          <w14:srgbClr w14:val="000000"/>
-        </w14:solidFill>
-      </w14:textFill>
     </w:rPr>
   </w:style>
   <w:style w:type="paragraph" w:styleId="ListParagraph">
@@ -4477,17 +4470,11 @@
       <w:kern w:val="0"/>
       <w:position w:val="0"/>
       <w:sz w:val="24"/>
-      <w:sz w:val="24"/>
       <w:szCs w:val="24"/>
       <w:u w:val="none"/>
       <w:shd w:fill="auto" w:val="clear"/>
       <w:vertAlign w:val="baseline"/>
       <w:lang w:val="en-US" w:eastAsia="zh-CN" w:bidi="hi-IN"/>
-      <w14:textFill>
-        <w14:solidFill>
-          <w14:srgbClr w14:val="000000"/>
-        </w14:solidFill>
-      </w14:textFill>
     </w:rPr>
   </w:style>
   <w:style w:type="paragraph" w:styleId="Body">
@@ -4520,7 +4507,6 @@
       <w:kern w:val="0"/>
       <w:position w:val="0"/>
       <w:sz w:val="24"/>
-      <w:sz w:val="24"/>
       <w:szCs w:val="24"/>
       <w:u w:val="none"/>
       <w:shd w:fill="auto" w:val="clear"/>
@@ -4529,11 +4515,6 @@
       <w14:textOutline>
         <w14:noFill/>
       </w14:textOutline>
-      <w14:textFill>
-        <w14:solidFill>
-          <w14:srgbClr w14:val="000000"/>
-        </w14:solidFill>
-      </w14:textFill>
     </w:rPr>
   </w:style>
   <w:style w:type="numbering" w:styleId="NoList" w:default="1">
@@ -4575,37 +4556,37 @@
         <a:srgbClr val="000000"/>
       </a:dk1>
       <a:lt1>
-        <a:srgbClr val="ffffff"/>
+        <a:srgbClr val="FFFFFF"/>
       </a:lt1>
       <a:dk2>
-        <a:srgbClr val="a7a7a7"/>
+        <a:srgbClr val="A7A7A7"/>
       </a:dk2>
       <a:lt2>
         <a:srgbClr val="535353"/>
       </a:lt2>
       <a:accent1>
-        <a:srgbClr val="4472c4"/>
+        <a:srgbClr val="4472C4"/>
       </a:accent1>
       <a:accent2>
-        <a:srgbClr val="ed7d31"/>
+        <a:srgbClr val="ED7D31"/>
       </a:accent2>
       <a:accent3>
-        <a:srgbClr val="a5a5a5"/>
+        <a:srgbClr val="A5A5A5"/>
       </a:accent3>
       <a:accent4>
-        <a:srgbClr val="ffc000"/>
+        <a:srgbClr val="FFC000"/>
       </a:accent4>
       <a:accent5>
-        <a:srgbClr val="5b9bd5"/>
+        <a:srgbClr val="5B9BD5"/>
       </a:accent5>
       <a:accent6>
-        <a:srgbClr val="70ad47"/>
+        <a:srgbClr val="70AD47"/>
       </a:accent6>
       <a:hlink>
-        <a:srgbClr val="0000ff"/>
+        <a:srgbClr val="0000FF"/>
       </a:hlink>
       <a:folHlink>
-        <a:srgbClr val="ff00ff"/>
+        <a:srgbClr val="FF00FF"/>
       </a:folHlink>
     </a:clrScheme>
     <a:fontScheme name="Office Theme">

</xml_diff>